<commit_message>
Fixed PRDS project team update
</commit_message>
<xml_diff>
--- a/docs/PING_PRDS_v0.1.docx
+++ b/docs/PING_PRDS_v0.1.docx
@@ -43,7 +43,7 @@
     <w:p>
       <w:pPr>
         <w:pBdr>
-          <w:bottom w:val="single" w:sz="6" w:space="8" w:color="2E5FA3"/>
+          <w:bottom w:val="single" w:color="2E5FA3" w:sz="6" w:space="8"/>
         </w:pBdr>
         <w:spacing w:after="200"/>
         <w:jc w:val="center"/>
@@ -145,20 +145,11 @@
       <w:pPr>
         <w:spacing w:after="30"/>
         <w:jc w:val="center"/>
-      </w:pPr>
-      <w:r>
         <w:rPr>
           <w:color w:val="2E5FA3"/>
           <w:sz w:val="19"/>
           <w:szCs w:val="19"/>
         </w:rPr>
-        <w:t>jsj830@outlook.com</w:t>
-      </w:r>
-    </w:p>
-    <w:p>
-      <w:pPr>
-        <w:spacing w:after="30"/>
-        <w:jc w:val="center"/>
       </w:pPr>
       <w:r>
         <w:rPr>
@@ -166,6 +157,28 @@
           <w:sz w:val="19"/>
           <w:szCs w:val="19"/>
         </w:rPr>
+        <w:t>j</w:t>
+      </w:r>
+      <w:r>
+        <w:rPr>
+          <w:color w:val="2E5FA3"/>
+          <w:sz w:val="19"/>
+          <w:szCs w:val="19"/>
+        </w:rPr>
+        <w:t>oshjacksonaudio@gmail.com</w:t>
+      </w:r>
+    </w:p>
+    <w:p>
+      <w:pPr>
+        <w:spacing w:after="30"/>
+        <w:jc w:val="center"/>
+      </w:pPr>
+      <w:r>
+        <w:rPr>
+          <w:color w:val="2E5FA3"/>
+          <w:sz w:val="19"/>
+          <w:szCs w:val="19"/>
+        </w:rPr>
         <w:t>linkedin.com/in/joshua-jackson-40a46225a</w:t>
       </w:r>
     </w:p>
@@ -181,30 +194,28 @@
       </w:pPr>
       <w:r>
         <w:rPr>
-          <w:i/>
-          <w:iCs/>
+          <w:i w:val="1"/>
+          <w:iCs w:val="1"/>
           <w:color w:val="555555"/>
           <w:sz w:val="18"/>
           <w:szCs w:val="18"/>
         </w:rPr>
         <w:t xml:space="preserve">PING (Portable Intelligent Noise Grid) is a modular 8-channel microphone array research platform for acoustic source localization, </w:t>
       </w:r>
-      <w:proofErr w:type="spellStart"/>
-      <w:r>
-        <w:rPr>
-          <w:i/>
-          <w:iCs/>
+      <w:r>
+        <w:rPr>
+          <w:i w:val="1"/>
+          <w:iCs w:val="1"/>
           <w:color w:val="555555"/>
           <w:sz w:val="18"/>
           <w:szCs w:val="18"/>
         </w:rPr>
         <w:t>beamforming</w:t>
       </w:r>
-      <w:proofErr w:type="spellEnd"/>
-      <w:r>
-        <w:rPr>
-          <w:i/>
-          <w:iCs/>
+      <w:r>
+        <w:rPr>
+          <w:i w:val="1"/>
+          <w:iCs w:val="1"/>
           <w:color w:val="555555"/>
           <w:sz w:val="18"/>
           <w:szCs w:val="18"/>
@@ -213,8 +224,8 @@
       </w:r>
       <w:r>
         <w:rPr>
-          <w:i/>
-          <w:iCs/>
+          <w:i w:val="1"/>
+          <w:iCs w:val="1"/>
           <w:color w:val="555555"/>
           <w:sz w:val="18"/>
           <w:szCs w:val="18"/>
@@ -223,13 +234,33 @@
       </w:r>
       <w:r>
         <w:rPr>
-          <w:i/>
-          <w:iCs/>
+          <w:i w:val="1"/>
+          <w:iCs w:val="1"/>
           <w:color w:val="555555"/>
           <w:sz w:val="18"/>
           <w:szCs w:val="18"/>
         </w:rPr>
-        <w:t xml:space="preserve"> initialized at startup via CLAP (Channel Level Acquisition Protocol), a built-in 8-channel synchronization and sensitivity verification test.</w:t>
+        <w:t xml:space="preserve"> initialized at startup via CLAP (Channel Level A</w:t>
+      </w:r>
+      <w:r>
+        <w:rPr>
+          <w:i w:val="1"/>
+          <w:iCs w:val="1"/>
+          <w:color w:val="555555"/>
+          <w:sz w:val="18"/>
+          <w:szCs w:val="18"/>
+        </w:rPr>
+        <w:t>ssessment</w:t>
+      </w:r>
+      <w:r>
+        <w:rPr>
+          <w:i w:val="1"/>
+          <w:iCs w:val="1"/>
+          <w:color w:val="555555"/>
+          <w:sz w:val="18"/>
+          <w:szCs w:val="18"/>
+        </w:rPr>
+        <w:t xml:space="preserve"> Protocol), a built-in 8-channel synchronization and sensitivity verification test.</w:t>
       </w:r>
     </w:p>
     <w:p>
@@ -257,7 +288,7 @@
     <w:p>
       <w:pPr>
         <w:pBdr>
-          <w:bottom w:val="single" w:sz="10" w:space="4" w:color="2E5FA3"/>
+          <w:bottom w:val="single" w:color="2E5FA3" w:sz="10" w:space="4"/>
         </w:pBdr>
         <w:spacing w:after="100"/>
       </w:pPr>
@@ -404,26 +435,226 @@
     </w:p>
     <w:p>
       <w:pPr>
+        <w:spacing w:before="200"/>
+      </w:pPr>
+      <w:r>
+        <w:rPr/>
+        <w:t xml:space="preserve">PING (Portable Intelligent Noise Grid) is a modular 8-channel microphone array research platform for acoustic source localization, </w:t>
+      </w:r>
+      <w:r>
+        <w:rPr/>
+        <w:t>beamforming</w:t>
+      </w:r>
+      <w:r>
+        <w:rPr/>
+        <w:t xml:space="preserve"> algorithm comparison, and array geometry investigation</w:t>
+      </w:r>
+      <w:r>
+        <w:rPr/>
+        <w:t>,</w:t>
+      </w:r>
+      <w:r>
+        <w:rPr/>
+        <w:t xml:space="preserve"> initialized at startup via CLAP (Channel Level A</w:t>
+      </w:r>
+      <w:r>
+        <w:rPr/>
+        <w:t>ssessment</w:t>
+      </w:r>
+      <w:r>
+        <w:rPr/>
+        <w:t xml:space="preserve"> Protocol), a built-in 8-channel synchronization and sensitivity verification test.</w:t>
+      </w:r>
+    </w:p>
+    <w:p>
+      <w:pPr>
         <w:spacing w:before="60" w:after="60"/>
       </w:pPr>
-      <w:r>
-        <w:t xml:space="preserve">PING (Portable Intelligent Noise Grid) is a modular 8-channel microphone array research platform for acoustic source localization, </w:t>
-      </w:r>
-      <w:proofErr w:type="spellStart"/>
-      <w:r>
-        <w:t>beamforming</w:t>
-      </w:r>
-      <w:proofErr w:type="spellEnd"/>
-      <w:r>
-        <w:t xml:space="preserve"> algorithm comparison, and array geometry investigation</w:t>
-      </w:r>
-      <w:r>
-        <w:t>,</w:t>
-      </w:r>
-      <w:r>
-        <w:t xml:space="preserve"> initialized at startup via CLAP (Channel Level Acquisition Protocol), a built-in 8-channel synchronization and sensitivity verification test.</w:t>
-      </w:r>
-    </w:p>
+    </w:p>
+    <w:p>
+      <w:pPr>
+        <w:pStyle w:val="Heading2"/>
+      </w:pPr>
+      <w:r>
+        <w:rPr/>
+        <w:t>1.7 Project Team</w:t>
+      </w:r>
+    </w:p>
+    <w:tbl>
+      <w:tblPr>
+        <w:tblStyle w:val="PlainTable1"/>
+        <w:tblW w:w="0" w:type="auto"/>
+        <w:tblLook w:val="06A0" w:firstRow="1" w:lastRow="0" w:firstColumn="1" w:lastColumn="0" w:noHBand="1" w:noVBand="1"/>
+      </w:tblPr>
+      <w:tblGrid>
+        <w:gridCol w:w="3240"/>
+        <w:gridCol w:w="3240"/>
+        <w:gridCol w:w="3240"/>
+      </w:tblGrid>
+      <w:tr xmlns:wp14="http://schemas.microsoft.com/office/word/2010/wordml" wp14:textId="77777777">
+        <w:trPr>
+          <w:trHeight w:val="300"/>
+        </w:trPr>
+        <w:tc>
+          <w:tcPr>
+            <w:cnfStyle w:val="001000000000" w:firstRow="0" w:lastRow="0" w:firstColumn="1" w:lastColumn="0" w:oddVBand="0" w:evenVBand="0" w:oddHBand="0" w:evenHBand="0" w:firstRowFirstColumn="0" w:firstRowLastColumn="0" w:lastRowFirstColumn="0" w:lastRowLastColumn="0"/>
+            <w:tcW w:w="3240" w:type="dxa"/>
+            <w:tcMar/>
+          </w:tcPr>
+          <w:p>
+            <w:pPr>
+              <w:pStyle w:val="Normal"/>
+            </w:pPr>
+            <w:r>
+              <w:rPr/>
+              <w:t>Role</w:t>
+            </w:r>
+          </w:p>
+        </w:tc>
+        <w:tc>
+          <w:tcPr>
+            <w:cnfStyle w:val="000000000000" w:firstRow="0" w:lastRow="0" w:firstColumn="0" w:lastColumn="0" w:oddVBand="0" w:evenVBand="0" w:oddHBand="0" w:evenHBand="0" w:firstRowFirstColumn="0" w:firstRowLastColumn="0" w:lastRowFirstColumn="0" w:lastRowLastColumn="0"/>
+            <w:tcW w:w="3240" w:type="dxa"/>
+            <w:tcMar/>
+          </w:tcPr>
+          <w:p>
+            <w:pPr>
+              <w:pStyle w:val="Normal"/>
+            </w:pPr>
+            <w:r>
+              <w:rPr/>
+              <w:t>Name</w:t>
+            </w:r>
+          </w:p>
+        </w:tc>
+        <w:tc>
+          <w:tcPr>
+            <w:cnfStyle w:val="000000000000" w:firstRow="0" w:lastRow="0" w:firstColumn="0" w:lastColumn="0" w:oddVBand="0" w:evenVBand="0" w:oddHBand="0" w:evenHBand="0" w:firstRowFirstColumn="0" w:firstRowLastColumn="0" w:lastRowFirstColumn="0" w:lastRowLastColumn="0"/>
+            <w:tcW w:w="3240" w:type="dxa"/>
+            <w:tcMar/>
+          </w:tcPr>
+          <w:p>
+            <w:pPr>
+              <w:pStyle w:val="Normal"/>
+            </w:pPr>
+            <w:r>
+              <w:rPr/>
+              <w:t>Responsibilities</w:t>
+            </w:r>
+          </w:p>
+        </w:tc>
+      </w:tr>
+      <w:tr xmlns:wp14="http://schemas.microsoft.com/office/word/2010/wordml" wp14:textId="77777777">
+        <w:trPr>
+          <w:trHeight w:val="300"/>
+        </w:trPr>
+        <w:tc>
+          <w:tcPr>
+            <w:cnfStyle w:val="001000000000" w:firstRow="0" w:lastRow="0" w:firstColumn="1" w:lastColumn="0" w:oddVBand="0" w:evenVBand="0" w:oddHBand="0" w:evenHBand="0" w:firstRowFirstColumn="0" w:firstRowLastColumn="0" w:lastRowFirstColumn="0" w:lastRowLastColumn="0"/>
+            <w:tcW w:w="3240" w:type="dxa"/>
+            <w:tcMar/>
+          </w:tcPr>
+          <w:p>
+            <w:pPr>
+              <w:pStyle w:val="Normal"/>
+            </w:pPr>
+            <w:r>
+              <w:rPr/>
+              <w:t>Project Lead / Lead Systems Engineer / Lead Software Developer</w:t>
+            </w:r>
+          </w:p>
+        </w:tc>
+        <w:tc>
+          <w:tcPr>
+            <w:cnfStyle w:val="000000000000" w:firstRow="0" w:lastRow="0" w:firstColumn="0" w:lastColumn="0" w:oddVBand="0" w:evenVBand="0" w:oddHBand="0" w:evenHBand="0" w:firstRowFirstColumn="0" w:firstRowLastColumn="0" w:lastRowFirstColumn="0" w:lastRowLastColumn="0"/>
+            <w:tcW w:w="3240" w:type="dxa"/>
+            <w:tcMar/>
+          </w:tcPr>
+          <w:p>
+            <w:pPr>
+              <w:pStyle w:val="Normal"/>
+            </w:pPr>
+            <w:r>
+              <w:rPr/>
+              <w:t>Joshua Jackson</w:t>
+            </w:r>
+          </w:p>
+        </w:tc>
+        <w:tc>
+          <w:tcPr>
+            <w:cnfStyle w:val="000000000000" w:firstRow="0" w:lastRow="0" w:firstColumn="0" w:lastColumn="0" w:oddVBand="0" w:evenVBand="0" w:oddHBand="0" w:evenHBand="0" w:firstRowFirstColumn="0" w:firstRowLastColumn="0" w:lastRowFirstColumn="0" w:lastRowLastColumn="0"/>
+            <w:tcW w:w="3240" w:type="dxa"/>
+            <w:tcMar/>
+          </w:tcPr>
+          <w:p>
+            <w:pPr>
+              <w:pStyle w:val="Normal"/>
+            </w:pPr>
+            <w:r>
+              <w:rPr/>
+              <w:t>Project conception, system architecture, requirements engineering, hardware design, signal processing, beamforming algorithms, experimental design, validation, documentation, project management, primary software development</w:t>
+            </w:r>
+          </w:p>
+        </w:tc>
+      </w:tr>
+      <w:tr xmlns:wp14="http://schemas.microsoft.com/office/word/2010/wordml" wp14:textId="77777777">
+        <w:trPr>
+          <w:trHeight w:val="300"/>
+        </w:trPr>
+        <w:tc>
+          <w:tcPr>
+            <w:cnfStyle w:val="001000000000" w:firstRow="0" w:lastRow="0" w:firstColumn="1" w:lastColumn="0" w:oddVBand="0" w:evenVBand="0" w:oddHBand="0" w:evenHBand="0" w:firstRowFirstColumn="0" w:firstRowLastColumn="0" w:lastRowFirstColumn="0" w:lastRowLastColumn="0"/>
+            <w:tcW w:w="3240" w:type="dxa"/>
+            <w:tcMar/>
+          </w:tcPr>
+          <w:p>
+            <w:pPr>
+              <w:pStyle w:val="Normal"/>
+            </w:pPr>
+            <w:r>
+              <w:rPr/>
+              <w:t>Software Development Contributor</w:t>
+            </w:r>
+          </w:p>
+        </w:tc>
+        <w:tc>
+          <w:tcPr>
+            <w:cnfStyle w:val="000000000000" w:firstRow="0" w:lastRow="0" w:firstColumn="0" w:lastColumn="0" w:oddVBand="0" w:evenVBand="0" w:oddHBand="0" w:evenHBand="0" w:firstRowFirstColumn="0" w:firstRowLastColumn="0" w:lastRowFirstColumn="0" w:lastRowLastColumn="0"/>
+            <w:tcW w:w="3240" w:type="dxa"/>
+            <w:tcMar/>
+          </w:tcPr>
+          <w:p>
+            <w:pPr>
+              <w:pStyle w:val="Normal"/>
+            </w:pPr>
+            <w:r>
+              <w:rPr/>
+              <w:t>Brian Harris</w:t>
+            </w:r>
+          </w:p>
+        </w:tc>
+        <w:tc>
+          <w:tcPr>
+            <w:cnfStyle w:val="000000000000" w:firstRow="0" w:lastRow="0" w:firstColumn="0" w:lastColumn="0" w:oddVBand="0" w:evenVBand="0" w:oddHBand="0" w:evenHBand="0" w:firstRowFirstColumn="0" w:firstRowLastColumn="0" w:lastRowFirstColumn="0" w:lastRowLastColumn="0"/>
+            <w:tcW w:w="3240" w:type="dxa"/>
+            <w:tcMar/>
+          </w:tcPr>
+          <w:p>
+            <w:pPr>
+              <w:pStyle w:val="Normal"/>
+            </w:pPr>
+            <w:r>
+              <w:rPr/>
+              <w:t>Assisted</w:t>
+            </w:r>
+            <w:r>
+              <w:rPr/>
+              <w:t xml:space="preserve"> with implementation of selected software modules under the technical direction, architectural guidance, and code review of the Project Lead</w:t>
+            </w:r>
+          </w:p>
+        </w:tc>
+      </w:tr>
+    </w:tbl>
     <w:p>
       <w:pPr>
         <w:spacing w:before="200"/>
@@ -435,7 +666,16 @@
         <w:spacing w:before="0"/>
       </w:pPr>
       <w:r>
-        <w:t>1.7 Sub-Protocols</w:t>
+        <w:rPr/>
+        <w:t>1.</w:t>
+      </w:r>
+      <w:r>
+        <w:rPr/>
+        <w:t>8</w:t>
+      </w:r>
+      <w:r>
+        <w:rPr/>
+        <w:t xml:space="preserve"> Sub-Protocols</w:t>
       </w:r>
     </w:p>
     <w:p>
@@ -463,13 +703,31 @@
           <w:numId w:val="2"/>
         </w:numPr>
         <w:spacing w:before="40" w:after="40"/>
-      </w:pPr>
-      <w:r>
         <w:rPr>
           <w:sz w:val="19"/>
           <w:szCs w:val="19"/>
         </w:rPr>
-        <w:t>CLAP — Channel Level Acquisition Protocol: the startup self-test sequence that verifies all 8 channels before any measurement begins</w:t>
+      </w:pPr>
+      <w:r>
+        <w:rPr>
+          <w:sz w:val="19"/>
+          <w:szCs w:val="19"/>
+        </w:rPr>
+        <w:t>CLAP — Channel Level A</w:t>
+      </w:r>
+      <w:r>
+        <w:rPr>
+          <w:sz w:val="19"/>
+          <w:szCs w:val="19"/>
+        </w:rPr>
+        <w:t>ssessment</w:t>
+      </w:r>
+      <w:r>
+        <w:rPr>
+          <w:sz w:val="19"/>
+          <w:szCs w:val="19"/>
+        </w:rPr>
+        <w:t xml:space="preserve"> Protocol: the startup self-test sequence that verifies all 8 channels before any measurement begins</w:t>
       </w:r>
     </w:p>
     <w:p>
@@ -497,7 +755,7 @@
     <w:p>
       <w:pPr>
         <w:pBdr>
-          <w:bottom w:val="single" w:sz="10" w:space="4" w:color="2E5FA3"/>
+          <w:bottom w:val="single" w:color="2E5FA3" w:sz="10" w:space="4"/>
         </w:pBdr>
         <w:spacing w:after="100"/>
       </w:pPr>
@@ -669,7 +927,7 @@
     <w:p>
       <w:pPr>
         <w:pBdr>
-          <w:bottom w:val="single" w:sz="10" w:space="4" w:color="2E5FA3"/>
+          <w:bottom w:val="single" w:color="2E5FA3" w:sz="10" w:space="4"/>
         </w:pBdr>
         <w:spacing w:after="100"/>
       </w:pPr>
@@ -747,7 +1005,28 @@
         <w:spacing w:before="60" w:after="60"/>
       </w:pPr>
       <w:r>
-        <w:t>Develop and validate a calibration procedure (CLAP — Channel Level Acquisition Protocol) that equalizes sensitivity across all 8 channels to within ±1 dB, ensuring measurement-grade consistency.</w:t>
+        <w:rPr/>
+        <w:t xml:space="preserve">Develop and </w:t>
+      </w:r>
+      <w:r>
+        <w:rPr/>
+        <w:t>validate</w:t>
+      </w:r>
+      <w:r>
+        <w:rPr/>
+        <w:t xml:space="preserve"> a calibration procedure (CLAP — Channel Level </w:t>
+      </w:r>
+      <w:r>
+        <w:rPr/>
+        <w:t>A</w:t>
+      </w:r>
+      <w:r>
+        <w:rPr/>
+        <w:t>ssessment</w:t>
+      </w:r>
+      <w:r>
+        <w:rPr/>
+        <w:t xml:space="preserve"> Protocol) that equalizes sensitivity across all 8 channels to within ±1 dB, ensuring measurement-grade consistency.</w:t>
       </w:r>
     </w:p>
     <w:p>
@@ -1143,7 +1422,7 @@
     <w:p>
       <w:pPr>
         <w:pBdr>
-          <w:bottom w:val="single" w:sz="10" w:space="4" w:color="2E5FA3"/>
+          <w:bottom w:val="single" w:color="2E5FA3" w:sz="10" w:space="4"/>
         </w:pBdr>
         <w:spacing w:after="100"/>
       </w:pPr>
@@ -1174,12 +1453,12 @@
       <w:tblPr>
         <w:tblW w:w="7800" w:type="dxa"/>
         <w:tblBorders>
-          <w:top w:val="single" w:sz="4" w:space="0" w:color="auto"/>
-          <w:left w:val="single" w:sz="4" w:space="0" w:color="auto"/>
-          <w:bottom w:val="single" w:sz="4" w:space="0" w:color="auto"/>
-          <w:right w:val="single" w:sz="4" w:space="0" w:color="auto"/>
-          <w:insideH w:val="single" w:sz="4" w:space="0" w:color="auto"/>
-          <w:insideV w:val="single" w:sz="4" w:space="0" w:color="auto"/>
+          <w:top w:val="single" w:color="auto" w:sz="4" w:space="0"/>
+          <w:left w:val="single" w:color="auto" w:sz="4" w:space="0"/>
+          <w:bottom w:val="single" w:color="auto" w:sz="4" w:space="0"/>
+          <w:right w:val="single" w:color="auto" w:sz="4" w:space="0"/>
+          <w:insideH w:val="single" w:color="auto" w:sz="4" w:space="0"/>
+          <w:insideV w:val="single" w:color="auto" w:sz="4" w:space="0"/>
         </w:tblBorders>
         <w:tblCellMar>
           <w:left w:w="10" w:type="dxa"/>
@@ -2314,12 +2593,12 @@
       <w:tblPr>
         <w:tblW w:w="7800" w:type="dxa"/>
         <w:tblBorders>
-          <w:top w:val="single" w:sz="4" w:space="0" w:color="auto"/>
-          <w:left w:val="single" w:sz="4" w:space="0" w:color="auto"/>
-          <w:bottom w:val="single" w:sz="4" w:space="0" w:color="auto"/>
-          <w:right w:val="single" w:sz="4" w:space="0" w:color="auto"/>
-          <w:insideH w:val="single" w:sz="4" w:space="0" w:color="auto"/>
-          <w:insideV w:val="single" w:sz="4" w:space="0" w:color="auto"/>
+          <w:top w:val="single" w:color="auto" w:sz="4" w:space="0"/>
+          <w:left w:val="single" w:color="auto" w:sz="4" w:space="0"/>
+          <w:bottom w:val="single" w:color="auto" w:sz="4" w:space="0"/>
+          <w:right w:val="single" w:color="auto" w:sz="4" w:space="0"/>
+          <w:insideH w:val="single" w:color="auto" w:sz="4" w:space="0"/>
+          <w:insideV w:val="single" w:color="auto" w:sz="4" w:space="0"/>
         </w:tblBorders>
         <w:tblCellMar>
           <w:left w:w="10" w:type="dxa"/>
@@ -3476,12 +3755,12 @@
       <w:tblPr>
         <w:tblW w:w="7800" w:type="dxa"/>
         <w:tblBorders>
-          <w:top w:val="single" w:sz="4" w:space="0" w:color="auto"/>
-          <w:left w:val="single" w:sz="4" w:space="0" w:color="auto"/>
-          <w:bottom w:val="single" w:sz="4" w:space="0" w:color="auto"/>
-          <w:right w:val="single" w:sz="4" w:space="0" w:color="auto"/>
-          <w:insideH w:val="single" w:sz="4" w:space="0" w:color="auto"/>
-          <w:insideV w:val="single" w:sz="4" w:space="0" w:color="auto"/>
+          <w:top w:val="single" w:color="auto" w:sz="4" w:space="0"/>
+          <w:left w:val="single" w:color="auto" w:sz="4" w:space="0"/>
+          <w:bottom w:val="single" w:color="auto" w:sz="4" w:space="0"/>
+          <w:right w:val="single" w:color="auto" w:sz="4" w:space="0"/>
+          <w:insideH w:val="single" w:color="auto" w:sz="4" w:space="0"/>
+          <w:insideV w:val="single" w:color="auto" w:sz="4" w:space="0"/>
         </w:tblBorders>
         <w:tblCellMar>
           <w:left w:w="10" w:type="dxa"/>
@@ -4224,12 +4503,12 @@
       <w:tblPr>
         <w:tblW w:w="7000" w:type="dxa"/>
         <w:tblBorders>
-          <w:top w:val="single" w:sz="4" w:space="0" w:color="auto"/>
-          <w:left w:val="single" w:sz="4" w:space="0" w:color="auto"/>
-          <w:bottom w:val="single" w:sz="4" w:space="0" w:color="auto"/>
-          <w:right w:val="single" w:sz="4" w:space="0" w:color="auto"/>
-          <w:insideH w:val="single" w:sz="4" w:space="0" w:color="auto"/>
-          <w:insideV w:val="single" w:sz="4" w:space="0" w:color="auto"/>
+          <w:top w:val="single" w:color="auto" w:sz="4" w:space="0"/>
+          <w:left w:val="single" w:color="auto" w:sz="4" w:space="0"/>
+          <w:bottom w:val="single" w:color="auto" w:sz="4" w:space="0"/>
+          <w:right w:val="single" w:color="auto" w:sz="4" w:space="0"/>
+          <w:insideH w:val="single" w:color="auto" w:sz="4" w:space="0"/>
+          <w:insideV w:val="single" w:color="auto" w:sz="4" w:space="0"/>
         </w:tblBorders>
         <w:tblCellMar>
           <w:left w:w="10" w:type="dxa"/>
@@ -4764,7 +5043,7 @@
     <w:p>
       <w:pPr>
         <w:pBdr>
-          <w:bottom w:val="single" w:sz="10" w:space="4" w:color="2E5FA3"/>
+          <w:bottom w:val="single" w:color="2E5FA3" w:sz="10" w:space="4"/>
         </w:pBdr>
         <w:spacing w:after="100"/>
       </w:pPr>
@@ -5090,12 +5369,12 @@
       <w:tblPr>
         <w:tblW w:w="7800" w:type="dxa"/>
         <w:tblBorders>
-          <w:top w:val="single" w:sz="4" w:space="0" w:color="auto"/>
-          <w:left w:val="single" w:sz="4" w:space="0" w:color="auto"/>
-          <w:bottom w:val="single" w:sz="4" w:space="0" w:color="auto"/>
-          <w:right w:val="single" w:sz="4" w:space="0" w:color="auto"/>
-          <w:insideH w:val="single" w:sz="4" w:space="0" w:color="auto"/>
-          <w:insideV w:val="single" w:sz="4" w:space="0" w:color="auto"/>
+          <w:top w:val="single" w:color="auto" w:sz="4" w:space="0"/>
+          <w:left w:val="single" w:color="auto" w:sz="4" w:space="0"/>
+          <w:bottom w:val="single" w:color="auto" w:sz="4" w:space="0"/>
+          <w:right w:val="single" w:color="auto" w:sz="4" w:space="0"/>
+          <w:insideH w:val="single" w:color="auto" w:sz="4" w:space="0"/>
+          <w:insideV w:val="single" w:color="auto" w:sz="4" w:space="0"/>
         </w:tblBorders>
         <w:tblCellMar>
           <w:left w:w="10" w:type="dxa"/>
@@ -5469,12 +5748,12 @@
       <w:tblPr>
         <w:tblW w:w="7800" w:type="dxa"/>
         <w:tblBorders>
-          <w:top w:val="single" w:sz="4" w:space="0" w:color="auto"/>
-          <w:left w:val="single" w:sz="4" w:space="0" w:color="auto"/>
-          <w:bottom w:val="single" w:sz="4" w:space="0" w:color="auto"/>
-          <w:right w:val="single" w:sz="4" w:space="0" w:color="auto"/>
-          <w:insideH w:val="single" w:sz="4" w:space="0" w:color="auto"/>
-          <w:insideV w:val="single" w:sz="4" w:space="0" w:color="auto"/>
+          <w:top w:val="single" w:color="auto" w:sz="4" w:space="0"/>
+          <w:left w:val="single" w:color="auto" w:sz="4" w:space="0"/>
+          <w:bottom w:val="single" w:color="auto" w:sz="4" w:space="0"/>
+          <w:right w:val="single" w:color="auto" w:sz="4" w:space="0"/>
+          <w:insideH w:val="single" w:color="auto" w:sz="4" w:space="0"/>
+          <w:insideV w:val="single" w:color="auto" w:sz="4" w:space="0"/>
         </w:tblBorders>
         <w:tblCellMar>
           <w:left w:w="10" w:type="dxa"/>
@@ -6155,12 +6434,12 @@
       <w:tblPr>
         <w:tblW w:w="7800" w:type="dxa"/>
         <w:tblBorders>
-          <w:top w:val="single" w:sz="4" w:space="0" w:color="auto"/>
-          <w:left w:val="single" w:sz="4" w:space="0" w:color="auto"/>
-          <w:bottom w:val="single" w:sz="4" w:space="0" w:color="auto"/>
-          <w:right w:val="single" w:sz="4" w:space="0" w:color="auto"/>
-          <w:insideH w:val="single" w:sz="4" w:space="0" w:color="auto"/>
-          <w:insideV w:val="single" w:sz="4" w:space="0" w:color="auto"/>
+          <w:top w:val="single" w:color="auto" w:sz="4" w:space="0"/>
+          <w:left w:val="single" w:color="auto" w:sz="4" w:space="0"/>
+          <w:bottom w:val="single" w:color="auto" w:sz="4" w:space="0"/>
+          <w:right w:val="single" w:color="auto" w:sz="4" w:space="0"/>
+          <w:insideH w:val="single" w:color="auto" w:sz="4" w:space="0"/>
+          <w:insideV w:val="single" w:color="auto" w:sz="4" w:space="0"/>
         </w:tblBorders>
         <w:tblCellMar>
           <w:left w:w="10" w:type="dxa"/>
@@ -6568,7 +6847,7 @@
     <w:p>
       <w:pPr>
         <w:pBdr>
-          <w:bottom w:val="single" w:sz="10" w:space="4" w:color="2E5FA3"/>
+          <w:bottom w:val="single" w:color="2E5FA3" w:sz="10" w:space="4"/>
         </w:pBdr>
         <w:spacing w:after="100"/>
       </w:pPr>
@@ -6607,12 +6886,12 @@
       <w:tblPr>
         <w:tblW w:w="7800" w:type="dxa"/>
         <w:tblBorders>
-          <w:top w:val="single" w:sz="4" w:space="0" w:color="auto"/>
-          <w:left w:val="single" w:sz="4" w:space="0" w:color="auto"/>
-          <w:bottom w:val="single" w:sz="4" w:space="0" w:color="auto"/>
-          <w:right w:val="single" w:sz="4" w:space="0" w:color="auto"/>
-          <w:insideH w:val="single" w:sz="4" w:space="0" w:color="auto"/>
-          <w:insideV w:val="single" w:sz="4" w:space="0" w:color="auto"/>
+          <w:top w:val="single" w:color="auto" w:sz="4" w:space="0"/>
+          <w:left w:val="single" w:color="auto" w:sz="4" w:space="0"/>
+          <w:bottom w:val="single" w:color="auto" w:sz="4" w:space="0"/>
+          <w:right w:val="single" w:color="auto" w:sz="4" w:space="0"/>
+          <w:insideH w:val="single" w:color="auto" w:sz="4" w:space="0"/>
+          <w:insideV w:val="single" w:color="auto" w:sz="4" w:space="0"/>
         </w:tblBorders>
         <w:tblCellMar>
           <w:left w:w="10" w:type="dxa"/>
@@ -7166,12 +7445,12 @@
       <w:tblPr>
         <w:tblW w:w="7800" w:type="dxa"/>
         <w:tblBorders>
-          <w:top w:val="single" w:sz="4" w:space="0" w:color="auto"/>
-          <w:left w:val="single" w:sz="4" w:space="0" w:color="auto"/>
-          <w:bottom w:val="single" w:sz="4" w:space="0" w:color="auto"/>
-          <w:right w:val="single" w:sz="4" w:space="0" w:color="auto"/>
-          <w:insideH w:val="single" w:sz="4" w:space="0" w:color="auto"/>
-          <w:insideV w:val="single" w:sz="4" w:space="0" w:color="auto"/>
+          <w:top w:val="single" w:color="auto" w:sz="4" w:space="0"/>
+          <w:left w:val="single" w:color="auto" w:sz="4" w:space="0"/>
+          <w:bottom w:val="single" w:color="auto" w:sz="4" w:space="0"/>
+          <w:right w:val="single" w:color="auto" w:sz="4" w:space="0"/>
+          <w:insideH w:val="single" w:color="auto" w:sz="4" w:space="0"/>
+          <w:insideV w:val="single" w:color="auto" w:sz="4" w:space="0"/>
         </w:tblBorders>
         <w:tblCellMar>
           <w:left w:w="10" w:type="dxa"/>
@@ -7750,12 +8029,12 @@
       <w:tblPr>
         <w:tblW w:w="7800" w:type="dxa"/>
         <w:tblBorders>
-          <w:top w:val="single" w:sz="4" w:space="0" w:color="auto"/>
-          <w:left w:val="single" w:sz="4" w:space="0" w:color="auto"/>
-          <w:bottom w:val="single" w:sz="4" w:space="0" w:color="auto"/>
-          <w:right w:val="single" w:sz="4" w:space="0" w:color="auto"/>
-          <w:insideH w:val="single" w:sz="4" w:space="0" w:color="auto"/>
-          <w:insideV w:val="single" w:sz="4" w:space="0" w:color="auto"/>
+          <w:top w:val="single" w:color="auto" w:sz="4" w:space="0"/>
+          <w:left w:val="single" w:color="auto" w:sz="4" w:space="0"/>
+          <w:bottom w:val="single" w:color="auto" w:sz="4" w:space="0"/>
+          <w:right w:val="single" w:color="auto" w:sz="4" w:space="0"/>
+          <w:insideH w:val="single" w:color="auto" w:sz="4" w:space="0"/>
+          <w:insideV w:val="single" w:color="auto" w:sz="4" w:space="0"/>
         </w:tblBorders>
         <w:tblCellMar>
           <w:left w:w="10" w:type="dxa"/>
@@ -9405,12 +9684,12 @@
       <w:tblPr>
         <w:tblW w:w="7800" w:type="dxa"/>
         <w:tblBorders>
-          <w:top w:val="single" w:sz="4" w:space="0" w:color="auto"/>
-          <w:left w:val="single" w:sz="4" w:space="0" w:color="auto"/>
-          <w:bottom w:val="single" w:sz="4" w:space="0" w:color="auto"/>
-          <w:right w:val="single" w:sz="4" w:space="0" w:color="auto"/>
-          <w:insideH w:val="single" w:sz="4" w:space="0" w:color="auto"/>
-          <w:insideV w:val="single" w:sz="4" w:space="0" w:color="auto"/>
+          <w:top w:val="single" w:color="auto" w:sz="4" w:space="0"/>
+          <w:left w:val="single" w:color="auto" w:sz="4" w:space="0"/>
+          <w:bottom w:val="single" w:color="auto" w:sz="4" w:space="0"/>
+          <w:right w:val="single" w:color="auto" w:sz="4" w:space="0"/>
+          <w:insideH w:val="single" w:color="auto" w:sz="4" w:space="0"/>
+          <w:insideV w:val="single" w:color="auto" w:sz="4" w:space="0"/>
         </w:tblBorders>
         <w:tblCellMar>
           <w:left w:w="10" w:type="dxa"/>
@@ -9842,7 +10121,7 @@
     <w:p>
       <w:pPr>
         <w:pBdr>
-          <w:bottom w:val="single" w:sz="10" w:space="4" w:color="2E5FA3"/>
+          <w:bottom w:val="single" w:color="2E5FA3" w:sz="10" w:space="4"/>
         </w:pBdr>
         <w:spacing w:after="100"/>
       </w:pPr>
@@ -9979,12 +10258,12 @@
       <w:tblPr>
         <w:tblW w:w="7800" w:type="dxa"/>
         <w:tblBorders>
-          <w:top w:val="single" w:sz="4" w:space="0" w:color="auto"/>
-          <w:left w:val="single" w:sz="4" w:space="0" w:color="auto"/>
-          <w:bottom w:val="single" w:sz="4" w:space="0" w:color="auto"/>
-          <w:right w:val="single" w:sz="4" w:space="0" w:color="auto"/>
-          <w:insideH w:val="single" w:sz="4" w:space="0" w:color="auto"/>
-          <w:insideV w:val="single" w:sz="4" w:space="0" w:color="auto"/>
+          <w:top w:val="single" w:color="auto" w:sz="4" w:space="0"/>
+          <w:left w:val="single" w:color="auto" w:sz="4" w:space="0"/>
+          <w:bottom w:val="single" w:color="auto" w:sz="4" w:space="0"/>
+          <w:right w:val="single" w:color="auto" w:sz="4" w:space="0"/>
+          <w:insideH w:val="single" w:color="auto" w:sz="4" w:space="0"/>
+          <w:insideV w:val="single" w:color="auto" w:sz="4" w:space="0"/>
         </w:tblBorders>
         <w:tblCellMar>
           <w:left w:w="10" w:type="dxa"/>
@@ -11221,7 +11500,16 @@
         <w:spacing w:before="60" w:after="60"/>
       </w:pPr>
       <w:r>
-        <w:t>CLAP (Channel Level Acquisition Protocol) executes at every PING startup:</w:t>
+        <w:rPr/>
+        <w:t>CLAP (Channel Level A</w:t>
+      </w:r>
+      <w:r>
+        <w:rPr/>
+        <w:t>ssessment</w:t>
+      </w:r>
+      <w:r>
+        <w:rPr/>
+        <w:t xml:space="preserve"> Protocol) executes at every PING startup:</w:t>
       </w:r>
     </w:p>
     <w:p>
@@ -11519,7 +11807,7 @@
     <w:p>
       <w:pPr>
         <w:pBdr>
-          <w:bottom w:val="single" w:sz="10" w:space="4" w:color="2E5FA3"/>
+          <w:bottom w:val="single" w:color="2E5FA3" w:sz="10" w:space="4"/>
         </w:pBdr>
         <w:spacing w:after="100"/>
       </w:pPr>
@@ -11769,12 +12057,12 @@
         <w:tblW w:w="7800" w:type="dxa"/>
         <w:tblInd w:w="-5" w:type="dxa"/>
         <w:tblBorders>
-          <w:top w:val="single" w:sz="4" w:space="0" w:color="auto"/>
-          <w:left w:val="single" w:sz="4" w:space="0" w:color="auto"/>
-          <w:bottom w:val="single" w:sz="4" w:space="0" w:color="auto"/>
-          <w:right w:val="single" w:sz="4" w:space="0" w:color="auto"/>
-          <w:insideH w:val="single" w:sz="4" w:space="0" w:color="auto"/>
-          <w:insideV w:val="single" w:sz="4" w:space="0" w:color="auto"/>
+          <w:top w:val="single" w:color="auto" w:sz="4" w:space="0"/>
+          <w:left w:val="single" w:color="auto" w:sz="4" w:space="0"/>
+          <w:bottom w:val="single" w:color="auto" w:sz="4" w:space="0"/>
+          <w:right w:val="single" w:color="auto" w:sz="4" w:space="0"/>
+          <w:insideH w:val="single" w:color="auto" w:sz="4" w:space="0"/>
+          <w:insideV w:val="single" w:color="auto" w:sz="4" w:space="0"/>
         </w:tblBorders>
         <w:tblCellMar>
           <w:left w:w="10" w:type="dxa"/>
@@ -13486,7 +13774,7 @@
     <w:p>
       <w:pPr>
         <w:pBdr>
-          <w:bottom w:val="single" w:sz="10" w:space="4" w:color="2E5FA3"/>
+          <w:bottom w:val="single" w:color="2E5FA3" w:sz="10" w:space="4"/>
         </w:pBdr>
         <w:spacing w:after="100"/>
       </w:pPr>
@@ -13558,12 +13846,12 @@
         <w:tblW w:w="7800" w:type="dxa"/>
         <w:tblInd w:w="-5" w:type="dxa"/>
         <w:tblBorders>
-          <w:top w:val="single" w:sz="4" w:space="0" w:color="auto"/>
-          <w:left w:val="single" w:sz="4" w:space="0" w:color="auto"/>
-          <w:bottom w:val="single" w:sz="4" w:space="0" w:color="auto"/>
-          <w:right w:val="single" w:sz="4" w:space="0" w:color="auto"/>
-          <w:insideH w:val="single" w:sz="4" w:space="0" w:color="auto"/>
-          <w:insideV w:val="single" w:sz="4" w:space="0" w:color="auto"/>
+          <w:top w:val="single" w:color="auto" w:sz="4" w:space="0"/>
+          <w:left w:val="single" w:color="auto" w:sz="4" w:space="0"/>
+          <w:bottom w:val="single" w:color="auto" w:sz="4" w:space="0"/>
+          <w:right w:val="single" w:color="auto" w:sz="4" w:space="0"/>
+          <w:insideH w:val="single" w:color="auto" w:sz="4" w:space="0"/>
+          <w:insideV w:val="single" w:color="auto" w:sz="4" w:space="0"/>
         </w:tblBorders>
         <w:tblCellMar>
           <w:left w:w="10" w:type="dxa"/>
@@ -16417,12 +16705,12 @@
         <w:tblW w:w="7800" w:type="dxa"/>
         <w:tblInd w:w="-5" w:type="dxa"/>
         <w:tblBorders>
-          <w:top w:val="single" w:sz="4" w:space="0" w:color="auto"/>
-          <w:left w:val="single" w:sz="4" w:space="0" w:color="auto"/>
-          <w:bottom w:val="single" w:sz="4" w:space="0" w:color="auto"/>
-          <w:right w:val="single" w:sz="4" w:space="0" w:color="auto"/>
-          <w:insideH w:val="single" w:sz="4" w:space="0" w:color="auto"/>
-          <w:insideV w:val="single" w:sz="4" w:space="0" w:color="auto"/>
+          <w:top w:val="single" w:color="auto" w:sz="4" w:space="0"/>
+          <w:left w:val="single" w:color="auto" w:sz="4" w:space="0"/>
+          <w:bottom w:val="single" w:color="auto" w:sz="4" w:space="0"/>
+          <w:right w:val="single" w:color="auto" w:sz="4" w:space="0"/>
+          <w:insideH w:val="single" w:color="auto" w:sz="4" w:space="0"/>
+          <w:insideV w:val="single" w:color="auto" w:sz="4" w:space="0"/>
         </w:tblBorders>
         <w:tblCellMar>
           <w:left w:w="10" w:type="dxa"/>
@@ -17052,12 +17340,12 @@
         <w:tblW w:w="7800" w:type="dxa"/>
         <w:tblInd w:w="-5" w:type="dxa"/>
         <w:tblBorders>
-          <w:top w:val="single" w:sz="4" w:space="0" w:color="auto"/>
-          <w:left w:val="single" w:sz="4" w:space="0" w:color="auto"/>
-          <w:bottom w:val="single" w:sz="4" w:space="0" w:color="auto"/>
-          <w:right w:val="single" w:sz="4" w:space="0" w:color="auto"/>
-          <w:insideH w:val="single" w:sz="4" w:space="0" w:color="auto"/>
-          <w:insideV w:val="single" w:sz="4" w:space="0" w:color="auto"/>
+          <w:top w:val="single" w:color="auto" w:sz="4" w:space="0"/>
+          <w:left w:val="single" w:color="auto" w:sz="4" w:space="0"/>
+          <w:bottom w:val="single" w:color="auto" w:sz="4" w:space="0"/>
+          <w:right w:val="single" w:color="auto" w:sz="4" w:space="0"/>
+          <w:insideH w:val="single" w:color="auto" w:sz="4" w:space="0"/>
+          <w:insideV w:val="single" w:color="auto" w:sz="4" w:space="0"/>
         </w:tblBorders>
         <w:tblCellMar>
           <w:left w:w="10" w:type="dxa"/>
@@ -17496,7 +17784,7 @@
     <w:p>
       <w:pPr>
         <w:pBdr>
-          <w:bottom w:val="single" w:sz="10" w:space="4" w:color="2E5FA3"/>
+          <w:bottom w:val="single" w:color="2E5FA3" w:sz="10" w:space="4"/>
         </w:pBdr>
         <w:spacing w:after="100"/>
       </w:pPr>
@@ -17548,12 +17836,12 @@
         <w:tblW w:w="7800" w:type="dxa"/>
         <w:tblInd w:w="-5" w:type="dxa"/>
         <w:tblBorders>
-          <w:top w:val="single" w:sz="4" w:space="0" w:color="auto"/>
-          <w:left w:val="single" w:sz="4" w:space="0" w:color="auto"/>
-          <w:bottom w:val="single" w:sz="4" w:space="0" w:color="auto"/>
-          <w:right w:val="single" w:sz="4" w:space="0" w:color="auto"/>
-          <w:insideH w:val="single" w:sz="4" w:space="0" w:color="auto"/>
-          <w:insideV w:val="single" w:sz="4" w:space="0" w:color="auto"/>
+          <w:top w:val="single" w:color="auto" w:sz="4" w:space="0"/>
+          <w:left w:val="single" w:color="auto" w:sz="4" w:space="0"/>
+          <w:bottom w:val="single" w:color="auto" w:sz="4" w:space="0"/>
+          <w:right w:val="single" w:color="auto" w:sz="4" w:space="0"/>
+          <w:insideH w:val="single" w:color="auto" w:sz="4" w:space="0"/>
+          <w:insideV w:val="single" w:color="auto" w:sz="4" w:space="0"/>
         </w:tblBorders>
         <w:tblCellMar>
           <w:left w:w="10" w:type="dxa"/>
@@ -17906,12 +18194,12 @@
         <w:tblW w:w="7800" w:type="dxa"/>
         <w:tblInd w:w="-5" w:type="dxa"/>
         <w:tblBorders>
-          <w:top w:val="single" w:sz="4" w:space="0" w:color="auto"/>
-          <w:left w:val="single" w:sz="4" w:space="0" w:color="auto"/>
-          <w:bottom w:val="single" w:sz="4" w:space="0" w:color="auto"/>
-          <w:right w:val="single" w:sz="4" w:space="0" w:color="auto"/>
-          <w:insideH w:val="single" w:sz="4" w:space="0" w:color="auto"/>
-          <w:insideV w:val="single" w:sz="4" w:space="0" w:color="auto"/>
+          <w:top w:val="single" w:color="auto" w:sz="4" w:space="0"/>
+          <w:left w:val="single" w:color="auto" w:sz="4" w:space="0"/>
+          <w:bottom w:val="single" w:color="auto" w:sz="4" w:space="0"/>
+          <w:right w:val="single" w:color="auto" w:sz="4" w:space="0"/>
+          <w:insideH w:val="single" w:color="auto" w:sz="4" w:space="0"/>
+          <w:insideV w:val="single" w:color="auto" w:sz="4" w:space="0"/>
         </w:tblBorders>
         <w:tblCellMar>
           <w:left w:w="10" w:type="dxa"/>
@@ -18765,12 +19053,12 @@
         <w:tblW w:w="7800" w:type="dxa"/>
         <w:tblInd w:w="-5" w:type="dxa"/>
         <w:tblBorders>
-          <w:top w:val="single" w:sz="4" w:space="0" w:color="auto"/>
-          <w:left w:val="single" w:sz="4" w:space="0" w:color="auto"/>
-          <w:bottom w:val="single" w:sz="4" w:space="0" w:color="auto"/>
-          <w:right w:val="single" w:sz="4" w:space="0" w:color="auto"/>
-          <w:insideH w:val="single" w:sz="4" w:space="0" w:color="auto"/>
-          <w:insideV w:val="single" w:sz="4" w:space="0" w:color="auto"/>
+          <w:top w:val="single" w:color="auto" w:sz="4" w:space="0"/>
+          <w:left w:val="single" w:color="auto" w:sz="4" w:space="0"/>
+          <w:bottom w:val="single" w:color="auto" w:sz="4" w:space="0"/>
+          <w:right w:val="single" w:color="auto" w:sz="4" w:space="0"/>
+          <w:insideH w:val="single" w:color="auto" w:sz="4" w:space="0"/>
+          <w:insideV w:val="single" w:color="auto" w:sz="4" w:space="0"/>
         </w:tblBorders>
         <w:tblCellMar>
           <w:left w:w="10" w:type="dxa"/>
@@ -19546,7 +19834,7 @@
     <w:p>
       <w:pPr>
         <w:pBdr>
-          <w:bottom w:val="single" w:sz="10" w:space="4" w:color="2E5FA3"/>
+          <w:bottom w:val="single" w:color="2E5FA3" w:sz="10" w:space="4"/>
         </w:pBdr>
         <w:spacing w:after="100"/>
       </w:pPr>
@@ -19592,12 +19880,12 @@
         <w:tblW w:w="7800" w:type="dxa"/>
         <w:tblInd w:w="-5" w:type="dxa"/>
         <w:tblBorders>
-          <w:top w:val="single" w:sz="4" w:space="0" w:color="auto"/>
-          <w:left w:val="single" w:sz="4" w:space="0" w:color="auto"/>
-          <w:bottom w:val="single" w:sz="4" w:space="0" w:color="auto"/>
-          <w:right w:val="single" w:sz="4" w:space="0" w:color="auto"/>
-          <w:insideH w:val="single" w:sz="4" w:space="0" w:color="auto"/>
-          <w:insideV w:val="single" w:sz="4" w:space="0" w:color="auto"/>
+          <w:top w:val="single" w:color="auto" w:sz="4" w:space="0"/>
+          <w:left w:val="single" w:color="auto" w:sz="4" w:space="0"/>
+          <w:bottom w:val="single" w:color="auto" w:sz="4" w:space="0"/>
+          <w:right w:val="single" w:color="auto" w:sz="4" w:space="0"/>
+          <w:insideH w:val="single" w:color="auto" w:sz="4" w:space="0"/>
+          <w:insideV w:val="single" w:color="auto" w:sz="4" w:space="0"/>
         </w:tblBorders>
         <w:tblCellMar>
           <w:left w:w="10" w:type="dxa"/>
@@ -21041,12 +21329,12 @@
         <w:tblW w:w="7800" w:type="dxa"/>
         <w:tblInd w:w="-5" w:type="dxa"/>
         <w:tblBorders>
-          <w:top w:val="single" w:sz="4" w:space="0" w:color="auto"/>
-          <w:left w:val="single" w:sz="4" w:space="0" w:color="auto"/>
-          <w:bottom w:val="single" w:sz="4" w:space="0" w:color="auto"/>
-          <w:right w:val="single" w:sz="4" w:space="0" w:color="auto"/>
-          <w:insideH w:val="single" w:sz="4" w:space="0" w:color="auto"/>
-          <w:insideV w:val="single" w:sz="4" w:space="0" w:color="auto"/>
+          <w:top w:val="single" w:color="auto" w:sz="4" w:space="0"/>
+          <w:left w:val="single" w:color="auto" w:sz="4" w:space="0"/>
+          <w:bottom w:val="single" w:color="auto" w:sz="4" w:space="0"/>
+          <w:right w:val="single" w:color="auto" w:sz="4" w:space="0"/>
+          <w:insideH w:val="single" w:color="auto" w:sz="4" w:space="0"/>
+          <w:insideV w:val="single" w:color="auto" w:sz="4" w:space="0"/>
         </w:tblBorders>
         <w:tblCellMar>
           <w:left w:w="10" w:type="dxa"/>
@@ -21470,12 +21758,12 @@
         <w:tblW w:w="7800" w:type="dxa"/>
         <w:tblInd w:w="-5" w:type="dxa"/>
         <w:tblBorders>
-          <w:top w:val="single" w:sz="4" w:space="0" w:color="auto"/>
-          <w:left w:val="single" w:sz="4" w:space="0" w:color="auto"/>
-          <w:bottom w:val="single" w:sz="4" w:space="0" w:color="auto"/>
-          <w:right w:val="single" w:sz="4" w:space="0" w:color="auto"/>
-          <w:insideH w:val="single" w:sz="4" w:space="0" w:color="auto"/>
-          <w:insideV w:val="single" w:sz="4" w:space="0" w:color="auto"/>
+          <w:top w:val="single" w:color="auto" w:sz="4" w:space="0"/>
+          <w:left w:val="single" w:color="auto" w:sz="4" w:space="0"/>
+          <w:bottom w:val="single" w:color="auto" w:sz="4" w:space="0"/>
+          <w:right w:val="single" w:color="auto" w:sz="4" w:space="0"/>
+          <w:insideH w:val="single" w:color="auto" w:sz="4" w:space="0"/>
+          <w:insideV w:val="single" w:color="auto" w:sz="4" w:space="0"/>
         </w:tblBorders>
         <w:tblCellMar>
           <w:left w:w="10" w:type="dxa"/>
@@ -22010,12 +22298,12 @@
         <w:tblW w:w="7800" w:type="dxa"/>
         <w:tblInd w:w="-5" w:type="dxa"/>
         <w:tblBorders>
-          <w:top w:val="single" w:sz="4" w:space="0" w:color="auto"/>
-          <w:left w:val="single" w:sz="4" w:space="0" w:color="auto"/>
-          <w:bottom w:val="single" w:sz="4" w:space="0" w:color="auto"/>
-          <w:right w:val="single" w:sz="4" w:space="0" w:color="auto"/>
-          <w:insideH w:val="single" w:sz="4" w:space="0" w:color="auto"/>
-          <w:insideV w:val="single" w:sz="4" w:space="0" w:color="auto"/>
+          <w:top w:val="single" w:color="auto" w:sz="4" w:space="0"/>
+          <w:left w:val="single" w:color="auto" w:sz="4" w:space="0"/>
+          <w:bottom w:val="single" w:color="auto" w:sz="4" w:space="0"/>
+          <w:right w:val="single" w:color="auto" w:sz="4" w:space="0"/>
+          <w:insideH w:val="single" w:color="auto" w:sz="4" w:space="0"/>
+          <w:insideV w:val="single" w:color="auto" w:sz="4" w:space="0"/>
         </w:tblBorders>
         <w:tblCellMar>
           <w:left w:w="10" w:type="dxa"/>
@@ -22493,7 +22781,7 @@
     <w:p>
       <w:pPr>
         <w:pBdr>
-          <w:bottom w:val="single" w:sz="10" w:space="4" w:color="2E5FA3"/>
+          <w:bottom w:val="single" w:color="2E5FA3" w:sz="10" w:space="4"/>
         </w:pBdr>
         <w:spacing w:after="100"/>
       </w:pPr>
@@ -23626,7 +23914,7 @@
     <w:p>
       <w:pPr>
         <w:pBdr>
-          <w:bottom w:val="single" w:sz="10" w:space="4" w:color="2E5FA3"/>
+          <w:bottom w:val="single" w:color="2E5FA3" w:sz="10" w:space="4"/>
         </w:pBdr>
         <w:spacing w:after="100"/>
       </w:pPr>
@@ -23675,11 +23963,75 @@
           <w:sz w:val="18"/>
           <w:szCs w:val="18"/>
         </w:rPr>
-        <w:t>Joshua Jackson  |  jsj830@outlook.com  |  linkedin.com/in/joshua-jackson-40a46225a</w:t>
+        <w:t xml:space="preserve">Joshua </w:t>
+      </w:r>
+      <w:r>
+        <w:rPr>
+          <w:color w:val="888888"/>
+          <w:sz w:val="18"/>
+          <w:szCs w:val="18"/>
+        </w:rPr>
+        <w:t>Jackson  |</w:t>
+      </w:r>
+      <w:r>
+        <w:rPr>
+          <w:color w:val="888888"/>
+          <w:sz w:val="18"/>
+          <w:szCs w:val="18"/>
+        </w:rPr>
+        <w:t xml:space="preserve">  </w:t>
+      </w:r>
+      <w:r>
+        <w:rPr>
+          <w:color w:val="888888"/>
+          <w:sz w:val="18"/>
+          <w:szCs w:val="18"/>
+        </w:rPr>
+        <w:t>j</w:t>
+      </w:r>
+      <w:r>
+        <w:rPr>
+          <w:color w:val="888888"/>
+          <w:sz w:val="18"/>
+          <w:szCs w:val="18"/>
+        </w:rPr>
+        <w:t>oshjacksonaudio</w:t>
+      </w:r>
+      <w:r>
+        <w:rPr>
+          <w:color w:val="888888"/>
+          <w:sz w:val="18"/>
+          <w:szCs w:val="18"/>
+        </w:rPr>
+        <w:t>@gmail.com</w:t>
+      </w:r>
+      <w:r>
+        <w:rPr>
+          <w:color w:val="888888"/>
+          <w:sz w:val="18"/>
+          <w:szCs w:val="18"/>
+        </w:rPr>
+        <w:t xml:space="preserve">  |</w:t>
+      </w:r>
+      <w:r>
+        <w:rPr>
+          <w:color w:val="888888"/>
+          <w:sz w:val="18"/>
+          <w:szCs w:val="18"/>
+        </w:rPr>
+        <w:t xml:space="preserve">  linkedin.com/</w:t>
+      </w:r>
+      <w:r>
+        <w:rPr>
+          <w:color w:val="888888"/>
+          <w:sz w:val="18"/>
+          <w:szCs w:val="18"/>
+        </w:rPr>
+        <w:t>in/joshua-jackson-40a46225a</w:t>
       </w:r>
     </w:p>
     <w:sectPr>
-      <w:pgSz w:w="12240" w:h="15840"/>
+      <w:pgSz w:w="12240" w:h="15840" w:orient="portrait"/>
       <w:pgMar w:top="1080" w:right="1260" w:bottom="1080" w:left="1260" w:header="708" w:footer="708" w:gutter="0"/>
       <w:cols w:space="720"/>
       <w:docGrid w:linePitch="360"/>
@@ -23789,7 +24141,7 @@
         <w:ind w:left="440" w:hanging="280"/>
       </w:pPr>
       <w:rPr>
-        <w:rFonts w:ascii="Arial" w:eastAsia="Arial" w:hAnsi="Arial" w:cs="Arial"/>
+        <w:rFonts w:ascii="Arial" w:hAnsi="Arial" w:eastAsia="Arial" w:cs="Arial"/>
         <w:color w:val="2E5FA3"/>
         <w:sz w:val="20"/>
         <w:szCs w:val="20"/>
@@ -23804,7 +24156,7 @@
         <w:ind w:left="720" w:hanging="280"/>
       </w:pPr>
       <w:rPr>
-        <w:rFonts w:ascii="Arial" w:eastAsia="Arial" w:hAnsi="Arial" w:cs="Arial"/>
+        <w:rFonts w:ascii="Arial" w:hAnsi="Arial" w:eastAsia="Arial" w:cs="Arial"/>
         <w:color w:val="888888"/>
         <w:sz w:val="18"/>
         <w:szCs w:val="18"/>
@@ -23862,11 +24214,11 @@
 </file>
 
 <file path=word/styles.xml><?xml version="1.0" encoding="utf-8"?>
-<w:styles xmlns:mc="http://schemas.openxmlformats.org/markup-compatibility/2006" xmlns:r="http://schemas.openxmlformats.org/officeDocument/2006/relationships" xmlns:w="http://schemas.openxmlformats.org/wordprocessingml/2006/main" xmlns:w14="http://schemas.microsoft.com/office/word/2010/wordml" xmlns:w15="http://schemas.microsoft.com/office/word/2012/wordml" xmlns:w16cex="http://schemas.microsoft.com/office/word/2018/wordml/cex" xmlns:w16cid="http://schemas.microsoft.com/office/word/2016/wordml/cid" xmlns:w16="http://schemas.microsoft.com/office/word/2018/wordml" xmlns:w16sdtdh="http://schemas.microsoft.com/office/word/2020/wordml/sdtdatahash" xmlns:w16sdtfl="http://schemas.microsoft.com/office/word/2024/wordml/sdtformatlock" xmlns:w16se="http://schemas.microsoft.com/office/word/2015/wordml/symex" xmlns:w16du="http://schemas.microsoft.com/office/word/2023/wordml/word16du" mc:Ignorable="w14 w15 w16se w16cid w16 w16cex w16sdtdh w16sdtfl w16du">
+<w:styles xmlns:wp14="http://schemas.microsoft.com/office/word/2010/wordprocessingDrawing" xmlns:mc="http://schemas.openxmlformats.org/markup-compatibility/2006" xmlns:r="http://schemas.openxmlformats.org/officeDocument/2006/relationships" xmlns:w="http://schemas.openxmlformats.org/wordprocessingml/2006/main" xmlns:w14="http://schemas.microsoft.com/office/word/2010/wordml" xmlns:w15="http://schemas.microsoft.com/office/word/2012/wordml" xmlns:w16cex="http://schemas.microsoft.com/office/word/2018/wordml/cex" xmlns:w16cid="http://schemas.microsoft.com/office/word/2016/wordml/cid" xmlns:w16="http://schemas.microsoft.com/office/word/2018/wordml" xmlns:w16sdtdh="http://schemas.microsoft.com/office/word/2020/wordml/sdtdatahash" xmlns:w16sdtfl="http://schemas.microsoft.com/office/word/2024/wordml/sdtformatlock" xmlns:w16se="http://schemas.microsoft.com/office/word/2015/wordml/symex" xmlns:w16du="http://schemas.microsoft.com/office/word/2023/wordml/word16du" mc:Ignorable="w14 w15 w16se w16cid w16 w16cex w16sdtdh w16sdtfl w16du wp14">
   <w:docDefaults>
     <w:rPrDefault>
       <w:rPr>
-        <w:rFonts w:ascii="Arial" w:eastAsia="Arial" w:hAnsi="Arial" w:cs="Arial"/>
+        <w:rFonts w:ascii="Arial" w:hAnsi="Arial" w:eastAsia="Arial" w:cs="Arial"/>
         <w:color w:val="2E2E2E"/>
         <w:lang w:val="en-US" w:eastAsia="en-US" w:bidi="ar-SA"/>
       </w:rPr>
@@ -23876,14 +24228,14 @@
   <w:latentStyles w:defLockedState="0" w:defUIPriority="99" w:defSemiHidden="0" w:defUnhideWhenUsed="0" w:defQFormat="0" w:count="376">
     <w:lsdException w:name="Normal" w:uiPriority="0" w:qFormat="1"/>
     <w:lsdException w:name="heading 1" w:uiPriority="9" w:qFormat="1"/>
-    <w:lsdException w:name="heading 2" w:semiHidden="1" w:uiPriority="9" w:unhideWhenUsed="1" w:qFormat="1"/>
-    <w:lsdException w:name="heading 3" w:semiHidden="1" w:uiPriority="9" w:unhideWhenUsed="1" w:qFormat="1"/>
-    <w:lsdException w:name="heading 4" w:semiHidden="1" w:uiPriority="9" w:unhideWhenUsed="1" w:qFormat="1"/>
-    <w:lsdException w:name="heading 5" w:semiHidden="1" w:uiPriority="9" w:unhideWhenUsed="1" w:qFormat="1"/>
-    <w:lsdException w:name="heading 6" w:semiHidden="1" w:uiPriority="9" w:unhideWhenUsed="1" w:qFormat="1"/>
-    <w:lsdException w:name="heading 7" w:semiHidden="1" w:uiPriority="9" w:unhideWhenUsed="1" w:qFormat="1"/>
-    <w:lsdException w:name="heading 8" w:semiHidden="1" w:uiPriority="9" w:unhideWhenUsed="1" w:qFormat="1"/>
-    <w:lsdException w:name="heading 9" w:semiHidden="1" w:uiPriority="9" w:unhideWhenUsed="1" w:qFormat="1"/>
+    <w:lsdException w:name="heading 2" w:uiPriority="9" w:semiHidden="1" w:unhideWhenUsed="1" w:qFormat="1"/>
+    <w:lsdException w:name="heading 3" w:uiPriority="9" w:semiHidden="1" w:unhideWhenUsed="1" w:qFormat="1"/>
+    <w:lsdException w:name="heading 4" w:uiPriority="9" w:semiHidden="1" w:unhideWhenUsed="1" w:qFormat="1"/>
+    <w:lsdException w:name="heading 5" w:uiPriority="9" w:semiHidden="1" w:unhideWhenUsed="1" w:qFormat="1"/>
+    <w:lsdException w:name="heading 6" w:uiPriority="9" w:semiHidden="1" w:unhideWhenUsed="1" w:qFormat="1"/>
+    <w:lsdException w:name="heading 7" w:uiPriority="9" w:semiHidden="1" w:unhideWhenUsed="1" w:qFormat="1"/>
+    <w:lsdException w:name="heading 8" w:uiPriority="9" w:semiHidden="1" w:unhideWhenUsed="1" w:qFormat="1"/>
+    <w:lsdException w:name="heading 9" w:uiPriority="9" w:semiHidden="1" w:unhideWhenUsed="1" w:qFormat="1"/>
     <w:lsdException w:name="index 1" w:semiHidden="1" w:unhideWhenUsed="1"/>
     <w:lsdException w:name="index 2" w:semiHidden="1" w:unhideWhenUsed="1"/>
     <w:lsdException w:name="index 3" w:semiHidden="1" w:unhideWhenUsed="1"/>
@@ -23893,22 +24245,22 @@
     <w:lsdException w:name="index 7" w:semiHidden="1" w:unhideWhenUsed="1"/>
     <w:lsdException w:name="index 8" w:semiHidden="1" w:unhideWhenUsed="1"/>
     <w:lsdException w:name="index 9" w:semiHidden="1" w:unhideWhenUsed="1"/>
-    <w:lsdException w:name="toc 1" w:semiHidden="1" w:uiPriority="39" w:unhideWhenUsed="1"/>
-    <w:lsdException w:name="toc 2" w:semiHidden="1" w:uiPriority="39" w:unhideWhenUsed="1"/>
-    <w:lsdException w:name="toc 3" w:semiHidden="1" w:uiPriority="39" w:unhideWhenUsed="1"/>
-    <w:lsdException w:name="toc 4" w:semiHidden="1" w:uiPriority="39" w:unhideWhenUsed="1"/>
-    <w:lsdException w:name="toc 5" w:semiHidden="1" w:uiPriority="39" w:unhideWhenUsed="1"/>
-    <w:lsdException w:name="toc 6" w:semiHidden="1" w:uiPriority="39" w:unhideWhenUsed="1"/>
-    <w:lsdException w:name="toc 7" w:semiHidden="1" w:uiPriority="39" w:unhideWhenUsed="1"/>
-    <w:lsdException w:name="toc 8" w:semiHidden="1" w:uiPriority="39" w:unhideWhenUsed="1"/>
-    <w:lsdException w:name="toc 9" w:semiHidden="1" w:uiPriority="39" w:unhideWhenUsed="1"/>
+    <w:lsdException w:name="toc 1" w:uiPriority="39" w:semiHidden="1" w:unhideWhenUsed="1"/>
+    <w:lsdException w:name="toc 2" w:uiPriority="39" w:semiHidden="1" w:unhideWhenUsed="1"/>
+    <w:lsdException w:name="toc 3" w:uiPriority="39" w:semiHidden="1" w:unhideWhenUsed="1"/>
+    <w:lsdException w:name="toc 4" w:uiPriority="39" w:semiHidden="1" w:unhideWhenUsed="1"/>
+    <w:lsdException w:name="toc 5" w:uiPriority="39" w:semiHidden="1" w:unhideWhenUsed="1"/>
+    <w:lsdException w:name="toc 6" w:uiPriority="39" w:semiHidden="1" w:unhideWhenUsed="1"/>
+    <w:lsdException w:name="toc 7" w:uiPriority="39" w:semiHidden="1" w:unhideWhenUsed="1"/>
+    <w:lsdException w:name="toc 8" w:uiPriority="39" w:semiHidden="1" w:unhideWhenUsed="1"/>
+    <w:lsdException w:name="toc 9" w:uiPriority="39" w:semiHidden="1" w:unhideWhenUsed="1"/>
     <w:lsdException w:name="Normal Indent" w:semiHidden="1" w:unhideWhenUsed="1"/>
     <w:lsdException w:name="footnote text" w:semiHidden="1" w:unhideWhenUsed="1"/>
     <w:lsdException w:name="annotation text" w:semiHidden="1" w:unhideWhenUsed="1"/>
     <w:lsdException w:name="header" w:semiHidden="1" w:unhideWhenUsed="1"/>
     <w:lsdException w:name="footer" w:semiHidden="1" w:unhideWhenUsed="1"/>
     <w:lsdException w:name="index heading" w:semiHidden="1" w:unhideWhenUsed="1"/>
-    <w:lsdException w:name="caption" w:semiHidden="1" w:uiPriority="35" w:unhideWhenUsed="1" w:qFormat="1"/>
+    <w:lsdException w:name="caption" w:uiPriority="35" w:semiHidden="1" w:unhideWhenUsed="1" w:qFormat="1"/>
     <w:lsdException w:name="table of figures" w:semiHidden="1" w:unhideWhenUsed="1"/>
     <w:lsdException w:name="envelope address" w:semiHidden="1" w:unhideWhenUsed="1"/>
     <w:lsdException w:name="envelope return" w:semiHidden="1" w:unhideWhenUsed="1"/>
@@ -23939,7 +24291,7 @@
     <w:lsdException w:name="Title" w:uiPriority="10" w:qFormat="1"/>
     <w:lsdException w:name="Closing" w:semiHidden="1" w:unhideWhenUsed="1"/>
     <w:lsdException w:name="Signature" w:semiHidden="1" w:unhideWhenUsed="1"/>
-    <w:lsdException w:name="Default Paragraph Font" w:semiHidden="1" w:uiPriority="1" w:unhideWhenUsed="1"/>
+    <w:lsdException w:name="Default Paragraph Font" w:uiPriority="1" w:semiHidden="1" w:unhideWhenUsed="1"/>
     <w:lsdException w:name="Body Text" w:semiHidden="1" w:unhideWhenUsed="1"/>
     <w:lsdException w:name="Body Text Indent" w:semiHidden="1" w:unhideWhenUsed="1"/>
     <w:lsdException w:name="List Continue" w:semiHidden="1" w:unhideWhenUsed="1"/>
@@ -24139,8 +24491,8 @@
     <w:lsdException w:name="Subtle Reference" w:uiPriority="31" w:qFormat="1"/>
     <w:lsdException w:name="Intense Reference" w:uiPriority="32" w:qFormat="1"/>
     <w:lsdException w:name="Book Title" w:uiPriority="33" w:qFormat="1"/>
-    <w:lsdException w:name="Bibliography" w:semiHidden="1" w:uiPriority="37" w:unhideWhenUsed="1"/>
-    <w:lsdException w:name="TOC Heading" w:semiHidden="1" w:uiPriority="39" w:unhideWhenUsed="1" w:qFormat="1"/>
+    <w:lsdException w:name="Bibliography" w:uiPriority="37" w:semiHidden="1" w:unhideWhenUsed="1"/>
+    <w:lsdException w:name="TOC Heading" w:uiPriority="39" w:semiHidden="1" w:unhideWhenUsed="1" w:qFormat="1"/>
     <w:lsdException w:name="Plain Table 1" w:uiPriority="41"/>
     <w:lsdException w:name="Plain Table 2" w:uiPriority="42"/>
     <w:lsdException w:name="Plain Table 3" w:uiPriority="43"/>
@@ -24251,7 +24603,7 @@
     <w:lsdException w:name="Unresolved Mention" w:semiHidden="1" w:unhideWhenUsed="1"/>
     <w:lsdException w:name="Smart Link" w:semiHidden="1" w:unhideWhenUsed="1"/>
   </w:latentStyles>
-  <w:style w:type="paragraph" w:default="1" w:styleId="Normal">
+  <w:style w:type="paragraph" w:styleId="Normal" w:default="1">
     <w:name w:val="Normal"/>
     <w:qFormat/>
   </w:style>
@@ -24346,13 +24698,13 @@
       <w:color w:val="1F4D78"/>
     </w:rPr>
   </w:style>
-  <w:style w:type="character" w:default="1" w:styleId="DefaultParagraphFont">
+  <w:style w:type="character" w:styleId="DefaultParagraphFont" w:default="1">
     <w:name w:val="Default Paragraph Font"/>
     <w:uiPriority w:val="1"/>
     <w:semiHidden/>
     <w:unhideWhenUsed/>
   </w:style>
-  <w:style w:type="table" w:default="1" w:styleId="TableNormal">
+  <w:style w:type="table" w:styleId="TableNormal" w:default="1">
     <w:name w:val="Normal Table"/>
     <w:uiPriority w:val="99"/>
     <w:semiHidden/>
@@ -24367,7 +24719,7 @@
       </w:tblCellMar>
     </w:tblPr>
   </w:style>
-  <w:style w:type="numbering" w:default="1" w:styleId="NoList">
+  <w:style w:type="numbering" w:styleId="NoList" w:default="1">
     <w:name w:val="No List"/>
     <w:uiPriority w:val="99"/>
     <w:semiHidden/>
@@ -24382,7 +24734,7 @@
       <w:szCs w:val="56"/>
     </w:rPr>
   </w:style>
-  <w:style w:type="paragraph" w:customStyle="1" w:styleId="Strong1">
+  <w:style w:type="paragraph" w:styleId="Strong1" w:customStyle="1">
     <w:name w:val="Strong1"/>
     <w:qFormat/>
     <w:rPr>
@@ -24419,7 +24771,7 @@
     <w:semiHidden/>
     <w:unhideWhenUsed/>
   </w:style>
-  <w:style w:type="character" w:customStyle="1" w:styleId="FootnoteTextChar">
+  <w:style w:type="character" w:styleId="FootnoteTextChar" w:customStyle="1">
     <w:name w:val="Footnote Text Char"/>
     <w:link w:val="FootnoteText"/>
     <w:uiPriority w:val="99"/>
@@ -24446,7 +24798,7 @@
     <w:semiHidden/>
     <w:unhideWhenUsed/>
   </w:style>
-  <w:style w:type="character" w:customStyle="1" w:styleId="EndnoteTextChar">
+  <w:style w:type="character" w:styleId="EndnoteTextChar" w:customStyle="1">
     <w:name w:val="Endnote Text Char"/>
     <w:link w:val="EndnoteText"/>
     <w:uiPriority w:val="99"/>
@@ -24457,11 +24809,106 @@
       <w:szCs w:val="20"/>
     </w:rPr>
   </w:style>
+  <w:style xmlns:w="http://schemas.openxmlformats.org/wordprocessingml/2006/main" w:type="table" w:styleId="TableGrid">
+    <w:name xmlns:w="http://schemas.openxmlformats.org/wordprocessingml/2006/main" w:val="Table Grid"/>
+    <w:basedOn xmlns:w="http://schemas.openxmlformats.org/wordprocessingml/2006/main" w:val="TableNormal"/>
+    <w:uiPriority xmlns:w="http://schemas.openxmlformats.org/wordprocessingml/2006/main" w:val="59"/>
+    <w:rsid xmlns:w="http://schemas.openxmlformats.org/wordprocessingml/2006/main" w:val="00FB4123"/>
+    <w:pPr xmlns:w="http://schemas.openxmlformats.org/wordprocessingml/2006/main">
+      <w:spacing w:after="0" w:line="240" w:lineRule="auto"/>
+    </w:pPr>
+    <w:tblPr xmlns:w="http://schemas.openxmlformats.org/wordprocessingml/2006/main">
+      <w:tblInd w:w="0" w:type="dxa"/>
+      <w:tblBorders>
+        <w:top w:val="single" w:color="000000" w:themeColor="text1" w:sz="4" w:space="0"/>
+        <w:left w:val="single" w:color="000000" w:themeColor="text1" w:sz="4" w:space="0"/>
+        <w:bottom w:val="single" w:color="000000" w:themeColor="text1" w:sz="4" w:space="0"/>
+        <w:right w:val="single" w:color="000000" w:themeColor="text1" w:sz="4" w:space="0"/>
+        <w:insideH w:val="single" w:color="000000" w:themeColor="text1" w:sz="4" w:space="0"/>
+        <w:insideV w:val="single" w:color="000000" w:themeColor="text1" w:sz="4" w:space="0"/>
+      </w:tblBorders>
+      <w:tblCellMar>
+        <w:top w:w="0" w:type="dxa"/>
+        <w:left w:w="108" w:type="dxa"/>
+        <w:bottom w:w="0" w:type="dxa"/>
+        <w:right w:w="108" w:type="dxa"/>
+      </w:tblCellMar>
+    </w:tblPr>
+  </w:style>
+  <w:style xmlns:w14="http://schemas.microsoft.com/office/word/2010/wordml" xmlns:mc="http://schemas.openxmlformats.org/markup-compatibility/2006" xmlns:w="http://schemas.openxmlformats.org/wordprocessingml/2006/main" w:type="table" w:styleId="PlainTable1" mc:Ignorable="w14">
+    <w:name xmlns:w="http://schemas.openxmlformats.org/wordprocessingml/2006/main" w:val="Plain Table 1"/>
+    <w:basedOn xmlns:w="http://schemas.openxmlformats.org/wordprocessingml/2006/main" w:val="TableNormal"/>
+    <w:uiPriority xmlns:w="http://schemas.openxmlformats.org/wordprocessingml/2006/main" w:val="41"/>
+    <w:pPr xmlns:w="http://schemas.openxmlformats.org/wordprocessingml/2006/main">
+      <w:spacing xmlns:w="http://schemas.openxmlformats.org/wordprocessingml/2006/main" w:after="0" w:line="240" w:lineRule="auto"/>
+    </w:pPr>
+    <w:tblPr xmlns:w="http://schemas.openxmlformats.org/wordprocessingml/2006/main">
+      <w:tblStyleRowBandSize w:val="1"/>
+      <w:tblStyleColBandSize w:val="1"/>
+      <w:tblInd w:w="0" w:type="dxa"/>
+      <w:tblBorders>
+        <w:top w:val="single" w:color="BFBFBF" w:themeColor="background1" w:themeShade="BF" w:sz="4" w:space="0"/>
+        <w:left w:val="single" w:color="BFBFBF" w:themeColor="background1" w:themeShade="BF" w:sz="4" w:space="0"/>
+        <w:bottom w:val="single" w:color="BFBFBF" w:themeColor="background1" w:themeShade="BF" w:sz="4" w:space="0"/>
+        <w:right w:val="single" w:color="BFBFBF" w:themeColor="background1" w:themeShade="BF" w:sz="4" w:space="0"/>
+        <w:insideH w:val="single" w:color="BFBFBF" w:themeColor="background1" w:themeShade="BF" w:sz="4" w:space="0"/>
+        <w:insideV w:val="single" w:color="BFBFBF" w:themeColor="background1" w:themeShade="BF" w:sz="4" w:space="0"/>
+      </w:tblBorders>
+      <w:tblCellMar>
+        <w:top w:w="0" w:type="dxa"/>
+        <w:left w:w="108" w:type="dxa"/>
+        <w:bottom w:w="0" w:type="dxa"/>
+        <w:right w:w="108" w:type="dxa"/>
+      </w:tblCellMar>
+    </w:tblPr>
+    <w:tblStylePr xmlns:w="http://schemas.openxmlformats.org/wordprocessingml/2006/main" w:type="firstRow">
+      <w:rPr>
+        <w:b/>
+        <w:bCs/>
+      </w:rPr>
+    </w:tblStylePr>
+    <w:tblStylePr xmlns:w="http://schemas.openxmlformats.org/wordprocessingml/2006/main" w:type="lastRow">
+      <w:rPr>
+        <w:b/>
+        <w:bCs/>
+      </w:rPr>
+      <w:tblPr/>
+      <w:tcPr>
+        <w:tcBorders>
+          <w:top w:val="double" w:color="BFBFBF" w:themeColor="background1" w:themeShade="BF" w:sz="4" w:space="0"/>
+        </w:tcBorders>
+      </w:tcPr>
+    </w:tblStylePr>
+    <w:tblStylePr xmlns:w="http://schemas.openxmlformats.org/wordprocessingml/2006/main" w:type="firstCol">
+      <w:rPr>
+        <w:b/>
+        <w:bCs/>
+      </w:rPr>
+    </w:tblStylePr>
+    <w:tblStylePr xmlns:w="http://schemas.openxmlformats.org/wordprocessingml/2006/main" w:type="lastCol">
+      <w:rPr>
+        <w:b/>
+        <w:bCs/>
+      </w:rPr>
+    </w:tblStylePr>
+    <w:tblStylePr xmlns:w="http://schemas.openxmlformats.org/wordprocessingml/2006/main" w:type="band1Vert">
+      <w:tblPr/>
+      <w:tcPr>
+        <w:shd w:val="clear" w:color="auto" w:fill="F2F2F2" w:themeFill="background1" w:themeFillShade="F2"/>
+      </w:tcPr>
+    </w:tblStylePr>
+    <w:tblStylePr xmlns:w="http://schemas.openxmlformats.org/wordprocessingml/2006/main" w:type="band1Horz">
+      <w:tblPr/>
+      <w:tcPr>
+        <w:shd w:val="clear" w:color="auto" w:fill="F2F2F2" w:themeFill="background1" w:themeFillShade="F2"/>
+      </w:tcPr>
+    </w:tblStylePr>
+  </w:style>
 </w:styles>
 </file>
 
 <file path=word/theme/theme1.xml><?xml version="1.0" encoding="utf-8"?>
-<a:theme xmlns:a="http://schemas.openxmlformats.org/drawingml/2006/main" name="Office Theme">
+<a:theme xmlns:a="http://schemas.openxmlformats.org/drawingml/2006/main" xmlns:thm15="http://schemas.microsoft.com/office/thememl/2012/main" name="Office Theme">
   <a:themeElements>
     <a:clrScheme name="Office">
       <a:dk1>

</xml_diff>

<commit_message>
Update file structure in PRDS to reflect accurately
</commit_message>
<xml_diff>
--- a/docs/PING_PRDS_v0.1.docx
+++ b/docs/PING_PRDS_v0.1.docx
@@ -6234,6 +6234,7 @@
           <w:numId w:val="2"/>
         </w:numPr>
         <w:spacing w:before="40" w:after="40"/>
+        <w:rPr/>
       </w:pPr>
       <w:r>
         <w:rPr>
@@ -6242,15 +6243,20 @@
         </w:rPr>
         <w:t xml:space="preserve">Layer 2: </w:t>
       </w:r>
-      <w:proofErr w:type="spellStart"/>
       <w:r>
         <w:rPr>
           <w:sz w:val="19"/>
           <w:szCs w:val="19"/>
         </w:rPr>
-        <w:t>oaap.hardware.interface</w:t>
-      </w:r>
-      <w:proofErr w:type="spellEnd"/>
+        <w:t>ping</w:t>
+      </w:r>
+      <w:r>
+        <w:rPr>
+          <w:sz w:val="19"/>
+          <w:szCs w:val="19"/>
+        </w:rPr>
+        <w:t>.hardware.interface</w:t>
+      </w:r>
       <w:r>
         <w:rPr>
           <w:sz w:val="19"/>
@@ -6267,13 +6273,35 @@
           <w:numId w:val="2"/>
         </w:numPr>
         <w:spacing w:before="40" w:after="40"/>
+        <w:rPr/>
       </w:pPr>
       <w:r>
         <w:rPr>
           <w:sz w:val="19"/>
           <w:szCs w:val="19"/>
         </w:rPr>
-        <w:t>Layer 2: oaap.calibration.sensitivity applies gain correction</w:t>
+        <w:t xml:space="preserve">Layer 2: </w:t>
+      </w:r>
+      <w:r>
+        <w:rPr>
+          <w:sz w:val="19"/>
+          <w:szCs w:val="19"/>
+        </w:rPr>
+        <w:t>ping</w:t>
+      </w:r>
+      <w:r>
+        <w:rPr>
+          <w:sz w:val="19"/>
+          <w:szCs w:val="19"/>
+        </w:rPr>
+        <w:t>.calibration.sensitivity</w:t>
+      </w:r>
+      <w:r>
+        <w:rPr>
+          <w:sz w:val="19"/>
+          <w:szCs w:val="19"/>
+        </w:rPr>
+        <w:t xml:space="preserve"> applies gain correction</w:t>
       </w:r>
     </w:p>
     <w:p>
@@ -6284,23 +6312,43 @@
           <w:numId w:val="2"/>
         </w:numPr>
         <w:spacing w:before="40" w:after="40"/>
+        <w:rPr/>
       </w:pPr>
       <w:r>
         <w:rPr>
           <w:sz w:val="19"/>
           <w:szCs w:val="19"/>
         </w:rPr>
-        <w:t xml:space="preserve">Layer 2: oaap.signal_processing.preprocessing applies DC removal, bandpass filter, </w:t>
-      </w:r>
-      <w:proofErr w:type="spellStart"/>
+        <w:t xml:space="preserve">Layer 2: </w:t>
+      </w:r>
       <w:r>
         <w:rPr>
           <w:sz w:val="19"/>
           <w:szCs w:val="19"/>
         </w:rPr>
+        <w:t>ping</w:t>
+      </w:r>
+      <w:r>
+        <w:rPr>
+          <w:sz w:val="19"/>
+          <w:szCs w:val="19"/>
+        </w:rPr>
+        <w:t>.signal_processing.preprocessing</w:t>
+      </w:r>
+      <w:r>
+        <w:rPr>
+          <w:sz w:val="19"/>
+          <w:szCs w:val="19"/>
+        </w:rPr>
+        <w:t xml:space="preserve"> applies DC removal, bandpass filter, </w:t>
+      </w:r>
+      <w:r>
+        <w:rPr>
+          <w:sz w:val="19"/>
+          <w:szCs w:val="19"/>
+        </w:rPr>
         <w:t>Hann</w:t>
       </w:r>
-      <w:proofErr w:type="spellEnd"/>
       <w:r>
         <w:rPr>
           <w:sz w:val="19"/>
@@ -6350,23 +6398,43 @@
           <w:numId w:val="2"/>
         </w:numPr>
         <w:spacing w:before="40" w:after="40"/>
+        <w:rPr/>
       </w:pPr>
       <w:r>
         <w:rPr>
           <w:sz w:val="19"/>
           <w:szCs w:val="19"/>
         </w:rPr>
-        <w:t xml:space="preserve">Layer 4: oaap.visualization.heatmap renders polar </w:t>
-      </w:r>
-      <w:proofErr w:type="spellStart"/>
+        <w:t xml:space="preserve">Layer 4: </w:t>
+      </w:r>
       <w:r>
         <w:rPr>
           <w:sz w:val="19"/>
           <w:szCs w:val="19"/>
         </w:rPr>
+        <w:t>ping</w:t>
+      </w:r>
+      <w:r>
+        <w:rPr>
+          <w:sz w:val="19"/>
+          <w:szCs w:val="19"/>
+        </w:rPr>
+        <w:t>.visualization.heatmap</w:t>
+      </w:r>
+      <w:r>
+        <w:rPr>
+          <w:sz w:val="19"/>
+          <w:szCs w:val="19"/>
+        </w:rPr>
+        <w:t xml:space="preserve"> renders polar </w:t>
+      </w:r>
+      <w:r>
+        <w:rPr>
+          <w:sz w:val="19"/>
+          <w:szCs w:val="19"/>
+        </w:rPr>
         <w:t>heatmap</w:t>
       </w:r>
-      <w:proofErr w:type="spellEnd"/>
       <w:r>
         <w:rPr>
           <w:sz w:val="19"/>
@@ -6383,6 +6451,7 @@
           <w:numId w:val="2"/>
         </w:numPr>
         <w:spacing w:before="40" w:after="40"/>
+        <w:rPr/>
       </w:pPr>
       <w:r>
         <w:rPr>
@@ -6391,15 +6460,20 @@
         </w:rPr>
         <w:t xml:space="preserve">Layer 4: </w:t>
       </w:r>
-      <w:proofErr w:type="spellStart"/>
       <w:r>
         <w:rPr>
           <w:sz w:val="19"/>
           <w:szCs w:val="19"/>
         </w:rPr>
-        <w:t>oaap.logging</w:t>
-      </w:r>
-      <w:proofErr w:type="spellEnd"/>
+        <w:t>ping</w:t>
+      </w:r>
+      <w:r>
+        <w:rPr>
+          <w:sz w:val="19"/>
+          <w:szCs w:val="19"/>
+        </w:rPr>
+        <w:t>.logging</w:t>
+      </w:r>
       <w:r>
         <w:rPr>
           <w:sz w:val="19"/>
@@ -10962,16 +11036,15 @@
           <w:numId w:val="2"/>
         </w:numPr>
         <w:spacing w:before="40" w:after="40"/>
-      </w:pPr>
-      <w:proofErr w:type="spellStart"/>
+        <w:rPr/>
+      </w:pPr>
       <w:r>
         <w:rPr>
           <w:sz w:val="19"/>
           <w:szCs w:val="19"/>
         </w:rPr>
-        <w:t>oaap</w:t>
-      </w:r>
-      <w:proofErr w:type="spellEnd"/>
+        <w:t>ping</w:t>
+      </w:r>
       <w:r>
         <w:rPr>
           <w:sz w:val="19"/>
@@ -10979,7 +11052,6 @@
         </w:rPr>
         <w:t xml:space="preserve">/hardware/ — all TASCAM communication; no other module calls </w:t>
       </w:r>
-      <w:proofErr w:type="spellStart"/>
       <w:r>
         <w:rPr>
           <w:sz w:val="19"/>
@@ -10987,7 +11059,6 @@
         </w:rPr>
         <w:t>sounddevice</w:t>
       </w:r>
-      <w:proofErr w:type="spellEnd"/>
       <w:r>
         <w:rPr>
           <w:sz w:val="19"/>
@@ -11004,16 +11075,15 @@
           <w:numId w:val="2"/>
         </w:numPr>
         <w:spacing w:before="40" w:after="40"/>
-      </w:pPr>
-      <w:proofErr w:type="spellStart"/>
+        <w:rPr/>
+      </w:pPr>
       <w:r>
         <w:rPr>
           <w:sz w:val="19"/>
           <w:szCs w:val="19"/>
         </w:rPr>
-        <w:t>oaap</w:t>
-      </w:r>
-      <w:proofErr w:type="spellEnd"/>
+        <w:t>ping</w:t>
+      </w:r>
       <w:r>
         <w:rPr>
           <w:sz w:val="19"/>
@@ -11030,16 +11100,15 @@
           <w:numId w:val="2"/>
         </w:numPr>
         <w:spacing w:before="40" w:after="40"/>
-      </w:pPr>
-      <w:proofErr w:type="spellStart"/>
+        <w:rPr/>
+      </w:pPr>
       <w:r>
         <w:rPr>
           <w:sz w:val="19"/>
           <w:szCs w:val="19"/>
         </w:rPr>
-        <w:t>oaap</w:t>
-      </w:r>
-      <w:proofErr w:type="spellEnd"/>
+        <w:t>ping</w:t>
+      </w:r>
       <w:r>
         <w:rPr>
           <w:sz w:val="19"/>
@@ -11056,22 +11125,35 @@
           <w:numId w:val="2"/>
         </w:numPr>
         <w:spacing w:before="40" w:after="40"/>
-      </w:pPr>
-      <w:proofErr w:type="spellStart"/>
+        <w:rPr/>
+      </w:pPr>
       <w:r>
         <w:rPr>
           <w:sz w:val="19"/>
           <w:szCs w:val="19"/>
         </w:rPr>
-        <w:t>oaap</w:t>
-      </w:r>
-      <w:proofErr w:type="spellEnd"/>
+        <w:t>ping</w:t>
+      </w:r>
       <w:r>
         <w:rPr>
           <w:sz w:val="19"/>
           <w:szCs w:val="19"/>
         </w:rPr>
-        <w:t>/signal_processing/ — acquisition, DC removal, bandpass filter, windowing</w:t>
+        <w:t>/</w:t>
+      </w:r>
+      <w:r>
+        <w:rPr>
+          <w:sz w:val="19"/>
+          <w:szCs w:val="19"/>
+        </w:rPr>
+        <w:t>signal_processing</w:t>
+      </w:r>
+      <w:r>
+        <w:rPr>
+          <w:sz w:val="19"/>
+          <w:szCs w:val="19"/>
+        </w:rPr>
+        <w:t>/ — acquisition, DC removal, bandpass filter, windowing</w:t>
       </w:r>
     </w:p>
     <w:p>
@@ -11082,16 +11164,15 @@
           <w:numId w:val="2"/>
         </w:numPr>
         <w:spacing w:before="40" w:after="40"/>
-      </w:pPr>
-      <w:proofErr w:type="spellStart"/>
+        <w:rPr/>
+      </w:pPr>
       <w:r>
         <w:rPr>
           <w:sz w:val="19"/>
           <w:szCs w:val="19"/>
         </w:rPr>
-        <w:t>oaap</w:t>
-      </w:r>
-      <w:proofErr w:type="spellEnd"/>
+        <w:t>ping</w:t>
+      </w:r>
       <w:r>
         <w:rPr>
           <w:sz w:val="19"/>
@@ -11099,7 +11180,6 @@
         </w:rPr>
         <w:t>/</w:t>
       </w:r>
-      <w:proofErr w:type="spellStart"/>
       <w:r>
         <w:rPr>
           <w:sz w:val="19"/>
@@ -11107,7 +11187,6 @@
         </w:rPr>
         <w:t>beamforming</w:t>
       </w:r>
-      <w:proofErr w:type="spellEnd"/>
       <w:r>
         <w:rPr>
           <w:sz w:val="19"/>
@@ -11124,16 +11203,15 @@
           <w:numId w:val="2"/>
         </w:numPr>
         <w:spacing w:before="40" w:after="40"/>
-      </w:pPr>
-      <w:proofErr w:type="spellStart"/>
+        <w:rPr/>
+      </w:pPr>
       <w:r>
         <w:rPr>
           <w:sz w:val="19"/>
           <w:szCs w:val="19"/>
         </w:rPr>
-        <w:t>oaap</w:t>
-      </w:r>
-      <w:proofErr w:type="spellEnd"/>
+        <w:t>ping</w:t>
+      </w:r>
       <w:r>
         <w:rPr>
           <w:sz w:val="19"/>
@@ -11141,7 +11219,6 @@
         </w:rPr>
         <w:t xml:space="preserve">/visualization/ — polar </w:t>
       </w:r>
-      <w:proofErr w:type="spellStart"/>
       <w:r>
         <w:rPr>
           <w:sz w:val="19"/>
@@ -11149,7 +11226,6 @@
         </w:rPr>
         <w:t>heatmap</w:t>
       </w:r>
-      <w:proofErr w:type="spellEnd"/>
       <w:r>
         <w:rPr>
           <w:sz w:val="19"/>

</xml_diff>

<commit_message>
Built YAML config parser and validated dataclasses. Built experiment log formatter, writing standardized metadata entries per FR-018
</commit_message>
<xml_diff>
--- a/docs/PING_PRDS_v0.1.docx
+++ b/docs/PING_PRDS_v0.1.docx
@@ -13956,6 +13956,7 @@
           <w:tcPr>
             <w:tcW w:w="900" w:type="dxa"/>
             <w:shd w:val="clear" w:color="auto" w:fill="1F3864"/>
+            <w:tcMar/>
           </w:tcPr>
           <w:p>
             <w:pPr>
@@ -13977,6 +13978,7 @@
           <w:tcPr>
             <w:tcW w:w="2000" w:type="dxa"/>
             <w:shd w:val="clear" w:color="auto" w:fill="1F3864"/>
+            <w:tcMar/>
           </w:tcPr>
           <w:p>
             <w:pPr>
@@ -13998,6 +14000,7 @@
           <w:tcPr>
             <w:tcW w:w="1800" w:type="dxa"/>
             <w:shd w:val="clear" w:color="auto" w:fill="1F3864"/>
+            <w:tcMar/>
           </w:tcPr>
           <w:p>
             <w:pPr>
@@ -14019,6 +14022,7 @@
           <w:tcPr>
             <w:tcW w:w="1400" w:type="dxa"/>
             <w:shd w:val="clear" w:color="auto" w:fill="1F3864"/>
+            <w:tcMar/>
           </w:tcPr>
           <w:p>
             <w:pPr>
@@ -14040,6 +14044,7 @@
           <w:tcPr>
             <w:tcW w:w="1700" w:type="dxa"/>
             <w:shd w:val="clear" w:color="auto" w:fill="1F3864"/>
+            <w:tcMar/>
           </w:tcPr>
           <w:p>
             <w:pPr>
@@ -14068,7 +14073,8 @@
         <w:tc>
           <w:tcPr>
             <w:tcW w:w="900" w:type="dxa"/>
-            <w:shd w:val="clear" w:color="auto" w:fill="FFFFFF"/>
+            <w:shd w:val="clear" w:color="auto" w:fill="FFFFFF" w:themeFill="background1"/>
+            <w:tcMar/>
           </w:tcPr>
           <w:p>
             <w:pPr>
@@ -14086,7 +14092,8 @@
         <w:tc>
           <w:tcPr>
             <w:tcW w:w="2000" w:type="dxa"/>
-            <w:shd w:val="clear" w:color="auto" w:fill="FFFFFF"/>
+            <w:shd w:val="clear" w:color="auto" w:fill="FFFFFF" w:themeFill="background1"/>
+            <w:tcMar/>
           </w:tcPr>
           <w:p>
             <w:pPr>
@@ -14104,7 +14111,8 @@
         <w:tc>
           <w:tcPr>
             <w:tcW w:w="1800" w:type="dxa"/>
-            <w:shd w:val="clear" w:color="auto" w:fill="FFFFFF"/>
+            <w:shd w:val="clear" w:color="auto" w:fill="FFFFFF" w:themeFill="background1"/>
+            <w:tcMar/>
           </w:tcPr>
           <w:p>
             <w:pPr>
@@ -14122,7 +14130,8 @@
         <w:tc>
           <w:tcPr>
             <w:tcW w:w="1400" w:type="dxa"/>
-            <w:shd w:val="clear" w:color="auto" w:fill="FFFFFF"/>
+            <w:shd w:val="clear" w:color="auto" w:fill="FFFFFF" w:themeFill="background1"/>
+            <w:tcMar/>
           </w:tcPr>
           <w:p>
             <w:pPr>
@@ -14140,18 +14149,19 @@
         <w:tc>
           <w:tcPr>
             <w:tcW w:w="1700" w:type="dxa"/>
-            <w:shd w:val="clear" w:color="auto" w:fill="FFFFFF"/>
-          </w:tcPr>
-          <w:p>
-            <w:pPr>
-              <w:spacing w:before="50" w:after="50"/>
-            </w:pPr>
-            <w:r>
-              <w:rPr>
-                <w:sz w:val="18"/>
-                <w:szCs w:val="18"/>
-              </w:rPr>
-              <w:t>⏳</w:t>
+            <w:shd w:val="clear" w:color="auto" w:fill="FFFFFF" w:themeFill="background1"/>
+            <w:tcMar/>
+          </w:tcPr>
+          <w:p>
+            <w:pPr>
+              <w:spacing w:before="50" w:after="50"/>
+            </w:pPr>
+            <w:r>
+              <w:rPr>
+                <w:sz w:val="18"/>
+                <w:szCs w:val="18"/>
+              </w:rPr>
+              <w:t>PLANNED</w:t>
             </w:r>
           </w:p>
         </w:tc>
@@ -14166,7 +14176,8 @@
         <w:tc>
           <w:tcPr>
             <w:tcW w:w="900" w:type="dxa"/>
-            <w:shd w:val="clear" w:color="auto" w:fill="F2F2F2"/>
+            <w:shd w:val="clear" w:color="auto" w:fill="F2F2F2" w:themeFill="background1" w:themeFillShade="F2"/>
+            <w:tcMar/>
           </w:tcPr>
           <w:p>
             <w:pPr>
@@ -14184,7 +14195,8 @@
         <w:tc>
           <w:tcPr>
             <w:tcW w:w="2000" w:type="dxa"/>
-            <w:shd w:val="clear" w:color="auto" w:fill="F2F2F2"/>
+            <w:shd w:val="clear" w:color="auto" w:fill="F2F2F2" w:themeFill="background1" w:themeFillShade="F2"/>
+            <w:tcMar/>
           </w:tcPr>
           <w:p>
             <w:pPr>
@@ -14202,7 +14214,8 @@
         <w:tc>
           <w:tcPr>
             <w:tcW w:w="1800" w:type="dxa"/>
-            <w:shd w:val="clear" w:color="auto" w:fill="F2F2F2"/>
+            <w:shd w:val="clear" w:color="auto" w:fill="F2F2F2" w:themeFill="background1" w:themeFillShade="F2"/>
+            <w:tcMar/>
           </w:tcPr>
           <w:p>
             <w:pPr>
@@ -14220,7 +14233,8 @@
         <w:tc>
           <w:tcPr>
             <w:tcW w:w="1400" w:type="dxa"/>
-            <w:shd w:val="clear" w:color="auto" w:fill="F2F2F2"/>
+            <w:shd w:val="clear" w:color="auto" w:fill="F2F2F2" w:themeFill="background1" w:themeFillShade="F2"/>
+            <w:tcMar/>
           </w:tcPr>
           <w:p>
             <w:pPr>
@@ -14238,18 +14252,19 @@
         <w:tc>
           <w:tcPr>
             <w:tcW w:w="1700" w:type="dxa"/>
-            <w:shd w:val="clear" w:color="auto" w:fill="F2F2F2"/>
-          </w:tcPr>
-          <w:p>
-            <w:pPr>
-              <w:spacing w:before="50" w:after="50"/>
-            </w:pPr>
-            <w:r>
-              <w:rPr>
-                <w:sz w:val="18"/>
-                <w:szCs w:val="18"/>
-              </w:rPr>
-              <w:t>⏳</w:t>
+            <w:shd w:val="clear" w:color="auto" w:fill="F2F2F2" w:themeFill="background1" w:themeFillShade="F2"/>
+            <w:tcMar/>
+          </w:tcPr>
+          <w:p>
+            <w:pPr>
+              <w:spacing w:before="50" w:after="50"/>
+            </w:pPr>
+            <w:r>
+              <w:rPr>
+                <w:sz w:val="18"/>
+                <w:szCs w:val="18"/>
+              </w:rPr>
+              <w:t>PLANNED</w:t>
             </w:r>
           </w:p>
         </w:tc>
@@ -14264,7 +14279,8 @@
         <w:tc>
           <w:tcPr>
             <w:tcW w:w="900" w:type="dxa"/>
-            <w:shd w:val="clear" w:color="auto" w:fill="FFFFFF"/>
+            <w:shd w:val="clear" w:color="auto" w:fill="FFFFFF" w:themeFill="background1"/>
+            <w:tcMar/>
           </w:tcPr>
           <w:p>
             <w:pPr>
@@ -14282,7 +14298,8 @@
         <w:tc>
           <w:tcPr>
             <w:tcW w:w="2000" w:type="dxa"/>
-            <w:shd w:val="clear" w:color="auto" w:fill="FFFFFF"/>
+            <w:shd w:val="clear" w:color="auto" w:fill="FFFFFF" w:themeFill="background1"/>
+            <w:tcMar/>
           </w:tcPr>
           <w:p>
             <w:pPr>
@@ -14300,7 +14317,8 @@
         <w:tc>
           <w:tcPr>
             <w:tcW w:w="1800" w:type="dxa"/>
-            <w:shd w:val="clear" w:color="auto" w:fill="FFFFFF"/>
+            <w:shd w:val="clear" w:color="auto" w:fill="FFFFFF" w:themeFill="background1"/>
+            <w:tcMar/>
           </w:tcPr>
           <w:p>
             <w:pPr>
@@ -14318,7 +14336,8 @@
         <w:tc>
           <w:tcPr>
             <w:tcW w:w="1400" w:type="dxa"/>
-            <w:shd w:val="clear" w:color="auto" w:fill="FFFFFF"/>
+            <w:shd w:val="clear" w:color="auto" w:fill="FFFFFF" w:themeFill="background1"/>
+            <w:tcMar/>
           </w:tcPr>
           <w:p>
             <w:pPr>
@@ -14336,18 +14355,19 @@
         <w:tc>
           <w:tcPr>
             <w:tcW w:w="1700" w:type="dxa"/>
-            <w:shd w:val="clear" w:color="auto" w:fill="FFFFFF"/>
-          </w:tcPr>
-          <w:p>
-            <w:pPr>
-              <w:spacing w:before="50" w:after="50"/>
-            </w:pPr>
-            <w:r>
-              <w:rPr>
-                <w:sz w:val="18"/>
-                <w:szCs w:val="18"/>
-              </w:rPr>
-              <w:t>⏳</w:t>
+            <w:shd w:val="clear" w:color="auto" w:fill="FFFFFF" w:themeFill="background1"/>
+            <w:tcMar/>
+          </w:tcPr>
+          <w:p>
+            <w:pPr>
+              <w:spacing w:before="50" w:after="50"/>
+            </w:pPr>
+            <w:r>
+              <w:rPr>
+                <w:sz w:val="18"/>
+                <w:szCs w:val="18"/>
+              </w:rPr>
+              <w:t>PLANNED</w:t>
             </w:r>
           </w:p>
         </w:tc>
@@ -14362,7 +14382,8 @@
         <w:tc>
           <w:tcPr>
             <w:tcW w:w="900" w:type="dxa"/>
-            <w:shd w:val="clear" w:color="auto" w:fill="F2F2F2"/>
+            <w:shd w:val="clear" w:color="auto" w:fill="F2F2F2" w:themeFill="background1" w:themeFillShade="F2"/>
+            <w:tcMar/>
           </w:tcPr>
           <w:p>
             <w:pPr>
@@ -14380,7 +14401,8 @@
         <w:tc>
           <w:tcPr>
             <w:tcW w:w="2000" w:type="dxa"/>
-            <w:shd w:val="clear" w:color="auto" w:fill="F2F2F2"/>
+            <w:shd w:val="clear" w:color="auto" w:fill="F2F2F2" w:themeFill="background1" w:themeFillShade="F2"/>
+            <w:tcMar/>
           </w:tcPr>
           <w:p>
             <w:pPr>
@@ -14398,7 +14420,8 @@
         <w:tc>
           <w:tcPr>
             <w:tcW w:w="1800" w:type="dxa"/>
-            <w:shd w:val="clear" w:color="auto" w:fill="F2F2F2"/>
+            <w:shd w:val="clear" w:color="auto" w:fill="F2F2F2" w:themeFill="background1" w:themeFillShade="F2"/>
+            <w:tcMar/>
           </w:tcPr>
           <w:p>
             <w:pPr>
@@ -14416,7 +14439,8 @@
         <w:tc>
           <w:tcPr>
             <w:tcW w:w="1400" w:type="dxa"/>
-            <w:shd w:val="clear" w:color="auto" w:fill="F2F2F2"/>
+            <w:shd w:val="clear" w:color="auto" w:fill="F2F2F2" w:themeFill="background1" w:themeFillShade="F2"/>
+            <w:tcMar/>
           </w:tcPr>
           <w:p>
             <w:pPr>
@@ -14434,18 +14458,19 @@
         <w:tc>
           <w:tcPr>
             <w:tcW w:w="1700" w:type="dxa"/>
-            <w:shd w:val="clear" w:color="auto" w:fill="F2F2F2"/>
-          </w:tcPr>
-          <w:p>
-            <w:pPr>
-              <w:spacing w:before="50" w:after="50"/>
-            </w:pPr>
-            <w:r>
-              <w:rPr>
-                <w:sz w:val="18"/>
-                <w:szCs w:val="18"/>
-              </w:rPr>
-              <w:t>⏳</w:t>
+            <w:shd w:val="clear" w:color="auto" w:fill="F2F2F2" w:themeFill="background1" w:themeFillShade="F2"/>
+            <w:tcMar/>
+          </w:tcPr>
+          <w:p>
+            <w:pPr>
+              <w:spacing w:before="50" w:after="50"/>
+            </w:pPr>
+            <w:r>
+              <w:rPr>
+                <w:sz w:val="18"/>
+                <w:szCs w:val="18"/>
+              </w:rPr>
+              <w:t>PLANNED</w:t>
             </w:r>
           </w:p>
         </w:tc>
@@ -14460,7 +14485,8 @@
         <w:tc>
           <w:tcPr>
             <w:tcW w:w="900" w:type="dxa"/>
-            <w:shd w:val="clear" w:color="auto" w:fill="FFFFFF"/>
+            <w:shd w:val="clear" w:color="auto" w:fill="FFFFFF" w:themeFill="background1"/>
+            <w:tcMar/>
           </w:tcPr>
           <w:p>
             <w:pPr>
@@ -14478,7 +14504,8 @@
         <w:tc>
           <w:tcPr>
             <w:tcW w:w="2000" w:type="dxa"/>
-            <w:shd w:val="clear" w:color="auto" w:fill="FFFFFF"/>
+            <w:shd w:val="clear" w:color="auto" w:fill="FFFFFF" w:themeFill="background1"/>
+            <w:tcMar/>
           </w:tcPr>
           <w:p>
             <w:pPr>
@@ -14496,7 +14523,8 @@
         <w:tc>
           <w:tcPr>
             <w:tcW w:w="1800" w:type="dxa"/>
-            <w:shd w:val="clear" w:color="auto" w:fill="FFFFFF"/>
+            <w:shd w:val="clear" w:color="auto" w:fill="FFFFFF" w:themeFill="background1"/>
+            <w:tcMar/>
           </w:tcPr>
           <w:p>
             <w:pPr>
@@ -14514,7 +14542,8 @@
         <w:tc>
           <w:tcPr>
             <w:tcW w:w="1400" w:type="dxa"/>
-            <w:shd w:val="clear" w:color="auto" w:fill="FFFFFF"/>
+            <w:shd w:val="clear" w:color="auto" w:fill="FFFFFF" w:themeFill="background1"/>
+            <w:tcMar/>
           </w:tcPr>
           <w:p>
             <w:pPr>
@@ -14532,18 +14561,19 @@
         <w:tc>
           <w:tcPr>
             <w:tcW w:w="1700" w:type="dxa"/>
-            <w:shd w:val="clear" w:color="auto" w:fill="FFFFFF"/>
-          </w:tcPr>
-          <w:p>
-            <w:pPr>
-              <w:spacing w:before="50" w:after="50"/>
-            </w:pPr>
-            <w:r>
-              <w:rPr>
-                <w:sz w:val="18"/>
-                <w:szCs w:val="18"/>
-              </w:rPr>
-              <w:t>⏳</w:t>
+            <w:shd w:val="clear" w:color="auto" w:fill="FFFFFF" w:themeFill="background1"/>
+            <w:tcMar/>
+          </w:tcPr>
+          <w:p>
+            <w:pPr>
+              <w:spacing w:before="50" w:after="50"/>
+            </w:pPr>
+            <w:r>
+              <w:rPr>
+                <w:sz w:val="18"/>
+                <w:szCs w:val="18"/>
+              </w:rPr>
+              <w:t>PLANNED</w:t>
             </w:r>
           </w:p>
         </w:tc>
@@ -14558,7 +14588,8 @@
         <w:tc>
           <w:tcPr>
             <w:tcW w:w="900" w:type="dxa"/>
-            <w:shd w:val="clear" w:color="auto" w:fill="F2F2F2"/>
+            <w:shd w:val="clear" w:color="auto" w:fill="F2F2F2" w:themeFill="background1" w:themeFillShade="F2"/>
+            <w:tcMar/>
           </w:tcPr>
           <w:p>
             <w:pPr>
@@ -14576,7 +14607,8 @@
         <w:tc>
           <w:tcPr>
             <w:tcW w:w="2000" w:type="dxa"/>
-            <w:shd w:val="clear" w:color="auto" w:fill="F2F2F2"/>
+            <w:shd w:val="clear" w:color="auto" w:fill="F2F2F2" w:themeFill="background1" w:themeFillShade="F2"/>
+            <w:tcMar/>
           </w:tcPr>
           <w:p>
             <w:pPr>
@@ -14594,7 +14626,8 @@
         <w:tc>
           <w:tcPr>
             <w:tcW w:w="1800" w:type="dxa"/>
-            <w:shd w:val="clear" w:color="auto" w:fill="F2F2F2"/>
+            <w:shd w:val="clear" w:color="auto" w:fill="F2F2F2" w:themeFill="background1" w:themeFillShade="F2"/>
+            <w:tcMar/>
           </w:tcPr>
           <w:p>
             <w:pPr>
@@ -14612,7 +14645,8 @@
         <w:tc>
           <w:tcPr>
             <w:tcW w:w="1400" w:type="dxa"/>
-            <w:shd w:val="clear" w:color="auto" w:fill="F2F2F2"/>
+            <w:shd w:val="clear" w:color="auto" w:fill="F2F2F2" w:themeFill="background1" w:themeFillShade="F2"/>
+            <w:tcMar/>
           </w:tcPr>
           <w:p>
             <w:pPr>
@@ -14630,18 +14664,19 @@
         <w:tc>
           <w:tcPr>
             <w:tcW w:w="1700" w:type="dxa"/>
-            <w:shd w:val="clear" w:color="auto" w:fill="F2F2F2"/>
-          </w:tcPr>
-          <w:p>
-            <w:pPr>
-              <w:spacing w:before="50" w:after="50"/>
-            </w:pPr>
-            <w:r>
-              <w:rPr>
-                <w:sz w:val="18"/>
-                <w:szCs w:val="18"/>
-              </w:rPr>
-              <w:t>⏳</w:t>
+            <w:shd w:val="clear" w:color="auto" w:fill="F2F2F2" w:themeFill="background1" w:themeFillShade="F2"/>
+            <w:tcMar/>
+          </w:tcPr>
+          <w:p>
+            <w:pPr>
+              <w:spacing w:before="50" w:after="50"/>
+            </w:pPr>
+            <w:r>
+              <w:rPr>
+                <w:sz w:val="18"/>
+                <w:szCs w:val="18"/>
+              </w:rPr>
+              <w:t>PLANNED</w:t>
             </w:r>
           </w:p>
         </w:tc>
@@ -14656,7 +14691,8 @@
         <w:tc>
           <w:tcPr>
             <w:tcW w:w="900" w:type="dxa"/>
-            <w:shd w:val="clear" w:color="auto" w:fill="FFFFFF"/>
+            <w:shd w:val="clear" w:color="auto" w:fill="FFFFFF" w:themeFill="background1"/>
+            <w:tcMar/>
           </w:tcPr>
           <w:p>
             <w:pPr>
@@ -14674,7 +14710,8 @@
         <w:tc>
           <w:tcPr>
             <w:tcW w:w="2000" w:type="dxa"/>
-            <w:shd w:val="clear" w:color="auto" w:fill="FFFFFF"/>
+            <w:shd w:val="clear" w:color="auto" w:fill="FFFFFF" w:themeFill="background1"/>
+            <w:tcMar/>
           </w:tcPr>
           <w:p>
             <w:pPr>
@@ -14692,7 +14729,8 @@
         <w:tc>
           <w:tcPr>
             <w:tcW w:w="1800" w:type="dxa"/>
-            <w:shd w:val="clear" w:color="auto" w:fill="FFFFFF"/>
+            <w:shd w:val="clear" w:color="auto" w:fill="FFFFFF" w:themeFill="background1"/>
+            <w:tcMar/>
           </w:tcPr>
           <w:p>
             <w:pPr>
@@ -14710,7 +14748,8 @@
         <w:tc>
           <w:tcPr>
             <w:tcW w:w="1400" w:type="dxa"/>
-            <w:shd w:val="clear" w:color="auto" w:fill="FFFFFF"/>
+            <w:shd w:val="clear" w:color="auto" w:fill="FFFFFF" w:themeFill="background1"/>
+            <w:tcMar/>
           </w:tcPr>
           <w:p>
             <w:pPr>
@@ -14728,18 +14767,19 @@
         <w:tc>
           <w:tcPr>
             <w:tcW w:w="1700" w:type="dxa"/>
-            <w:shd w:val="clear" w:color="auto" w:fill="FFFFFF"/>
-          </w:tcPr>
-          <w:p>
-            <w:pPr>
-              <w:spacing w:before="50" w:after="50"/>
-            </w:pPr>
-            <w:r>
-              <w:rPr>
-                <w:sz w:val="18"/>
-                <w:szCs w:val="18"/>
-              </w:rPr>
-              <w:t>⏳</w:t>
+            <w:shd w:val="clear" w:color="auto" w:fill="FFFFFF" w:themeFill="background1"/>
+            <w:tcMar/>
+          </w:tcPr>
+          <w:p>
+            <w:pPr>
+              <w:spacing w:before="50" w:after="50"/>
+            </w:pPr>
+            <w:r>
+              <w:rPr>
+                <w:sz w:val="18"/>
+                <w:szCs w:val="18"/>
+              </w:rPr>
+              <w:t>PLANNED</w:t>
             </w:r>
           </w:p>
         </w:tc>
@@ -14754,7 +14794,8 @@
         <w:tc>
           <w:tcPr>
             <w:tcW w:w="900" w:type="dxa"/>
-            <w:shd w:val="clear" w:color="auto" w:fill="F2F2F2"/>
+            <w:shd w:val="clear" w:color="auto" w:fill="F2F2F2" w:themeFill="background1" w:themeFillShade="F2"/>
+            <w:tcMar/>
           </w:tcPr>
           <w:p>
             <w:pPr>
@@ -14772,7 +14813,8 @@
         <w:tc>
           <w:tcPr>
             <w:tcW w:w="2000" w:type="dxa"/>
-            <w:shd w:val="clear" w:color="auto" w:fill="F2F2F2"/>
+            <w:shd w:val="clear" w:color="auto" w:fill="F2F2F2" w:themeFill="background1" w:themeFillShade="F2"/>
+            <w:tcMar/>
           </w:tcPr>
           <w:p>
             <w:pPr>
@@ -14790,7 +14832,8 @@
         <w:tc>
           <w:tcPr>
             <w:tcW w:w="1800" w:type="dxa"/>
-            <w:shd w:val="clear" w:color="auto" w:fill="F2F2F2"/>
+            <w:shd w:val="clear" w:color="auto" w:fill="F2F2F2" w:themeFill="background1" w:themeFillShade="F2"/>
+            <w:tcMar/>
           </w:tcPr>
           <w:p>
             <w:pPr>
@@ -14808,7 +14851,8 @@
         <w:tc>
           <w:tcPr>
             <w:tcW w:w="1400" w:type="dxa"/>
-            <w:shd w:val="clear" w:color="auto" w:fill="F2F2F2"/>
+            <w:shd w:val="clear" w:color="auto" w:fill="F2F2F2" w:themeFill="background1" w:themeFillShade="F2"/>
+            <w:tcMar/>
           </w:tcPr>
           <w:p>
             <w:pPr>
@@ -14826,18 +14870,19 @@
         <w:tc>
           <w:tcPr>
             <w:tcW w:w="1700" w:type="dxa"/>
-            <w:shd w:val="clear" w:color="auto" w:fill="F2F2F2"/>
-          </w:tcPr>
-          <w:p>
-            <w:pPr>
-              <w:spacing w:before="50" w:after="50"/>
-            </w:pPr>
-            <w:r>
-              <w:rPr>
-                <w:sz w:val="18"/>
-                <w:szCs w:val="18"/>
-              </w:rPr>
-              <w:t>⏳</w:t>
+            <w:shd w:val="clear" w:color="auto" w:fill="F2F2F2" w:themeFill="background1" w:themeFillShade="F2"/>
+            <w:tcMar/>
+          </w:tcPr>
+          <w:p>
+            <w:pPr>
+              <w:spacing w:before="50" w:after="50"/>
+            </w:pPr>
+            <w:r>
+              <w:rPr>
+                <w:sz w:val="18"/>
+                <w:szCs w:val="18"/>
+              </w:rPr>
+              <w:t>PLANNED</w:t>
             </w:r>
           </w:p>
         </w:tc>
@@ -14852,7 +14897,8 @@
         <w:tc>
           <w:tcPr>
             <w:tcW w:w="900" w:type="dxa"/>
-            <w:shd w:val="clear" w:color="auto" w:fill="FFFFFF"/>
+            <w:shd w:val="clear" w:color="auto" w:fill="FFFFFF" w:themeFill="background1"/>
+            <w:tcMar/>
           </w:tcPr>
           <w:p>
             <w:pPr>
@@ -14870,7 +14916,8 @@
         <w:tc>
           <w:tcPr>
             <w:tcW w:w="2000" w:type="dxa"/>
-            <w:shd w:val="clear" w:color="auto" w:fill="FFFFFF"/>
+            <w:shd w:val="clear" w:color="auto" w:fill="FFFFFF" w:themeFill="background1"/>
+            <w:tcMar/>
           </w:tcPr>
           <w:p>
             <w:pPr>
@@ -14888,7 +14935,8 @@
         <w:tc>
           <w:tcPr>
             <w:tcW w:w="1800" w:type="dxa"/>
-            <w:shd w:val="clear" w:color="auto" w:fill="FFFFFF"/>
+            <w:shd w:val="clear" w:color="auto" w:fill="FFFFFF" w:themeFill="background1"/>
+            <w:tcMar/>
           </w:tcPr>
           <w:p>
             <w:pPr>
@@ -14906,7 +14954,8 @@
         <w:tc>
           <w:tcPr>
             <w:tcW w:w="1400" w:type="dxa"/>
-            <w:shd w:val="clear" w:color="auto" w:fill="FFFFFF"/>
+            <w:shd w:val="clear" w:color="auto" w:fill="FFFFFF" w:themeFill="background1"/>
+            <w:tcMar/>
           </w:tcPr>
           <w:p>
             <w:pPr>
@@ -14924,18 +14973,19 @@
         <w:tc>
           <w:tcPr>
             <w:tcW w:w="1700" w:type="dxa"/>
-            <w:shd w:val="clear" w:color="auto" w:fill="FFFFFF"/>
-          </w:tcPr>
-          <w:p>
-            <w:pPr>
-              <w:spacing w:before="50" w:after="50"/>
-            </w:pPr>
-            <w:r>
-              <w:rPr>
-                <w:sz w:val="18"/>
-                <w:szCs w:val="18"/>
-              </w:rPr>
-              <w:t>⏳</w:t>
+            <w:shd w:val="clear" w:color="auto" w:fill="FFFFFF" w:themeFill="background1"/>
+            <w:tcMar/>
+          </w:tcPr>
+          <w:p>
+            <w:pPr>
+              <w:spacing w:before="50" w:after="50"/>
+            </w:pPr>
+            <w:r>
+              <w:rPr>
+                <w:sz w:val="18"/>
+                <w:szCs w:val="18"/>
+              </w:rPr>
+              <w:t>PLANNED</w:t>
             </w:r>
           </w:p>
         </w:tc>
@@ -14950,7 +15000,8 @@
         <w:tc>
           <w:tcPr>
             <w:tcW w:w="900" w:type="dxa"/>
-            <w:shd w:val="clear" w:color="auto" w:fill="F2F2F2"/>
+            <w:shd w:val="clear" w:color="auto" w:fill="F2F2F2" w:themeFill="background1" w:themeFillShade="F2"/>
+            <w:tcMar/>
           </w:tcPr>
           <w:p>
             <w:pPr>
@@ -14968,7 +15019,8 @@
         <w:tc>
           <w:tcPr>
             <w:tcW w:w="2000" w:type="dxa"/>
-            <w:shd w:val="clear" w:color="auto" w:fill="F2F2F2"/>
+            <w:shd w:val="clear" w:color="auto" w:fill="F2F2F2" w:themeFill="background1" w:themeFillShade="F2"/>
+            <w:tcMar/>
           </w:tcPr>
           <w:p>
             <w:pPr>
@@ -14986,7 +15038,8 @@
         <w:tc>
           <w:tcPr>
             <w:tcW w:w="1800" w:type="dxa"/>
-            <w:shd w:val="clear" w:color="auto" w:fill="F2F2F2"/>
+            <w:shd w:val="clear" w:color="auto" w:fill="F2F2F2" w:themeFill="background1" w:themeFillShade="F2"/>
+            <w:tcMar/>
           </w:tcPr>
           <w:p>
             <w:pPr>
@@ -15004,7 +15057,8 @@
         <w:tc>
           <w:tcPr>
             <w:tcW w:w="1400" w:type="dxa"/>
-            <w:shd w:val="clear" w:color="auto" w:fill="F2F2F2"/>
+            <w:shd w:val="clear" w:color="auto" w:fill="F2F2F2" w:themeFill="background1" w:themeFillShade="F2"/>
+            <w:tcMar/>
           </w:tcPr>
           <w:p>
             <w:pPr>
@@ -15022,18 +15076,19 @@
         <w:tc>
           <w:tcPr>
             <w:tcW w:w="1700" w:type="dxa"/>
-            <w:shd w:val="clear" w:color="auto" w:fill="F2F2F2"/>
-          </w:tcPr>
-          <w:p>
-            <w:pPr>
-              <w:spacing w:before="50" w:after="50"/>
-            </w:pPr>
-            <w:r>
-              <w:rPr>
-                <w:sz w:val="18"/>
-                <w:szCs w:val="18"/>
-              </w:rPr>
-              <w:t>⏳</w:t>
+            <w:shd w:val="clear" w:color="auto" w:fill="F2F2F2" w:themeFill="background1" w:themeFillShade="F2"/>
+            <w:tcMar/>
+          </w:tcPr>
+          <w:p>
+            <w:pPr>
+              <w:spacing w:before="50" w:after="50"/>
+            </w:pPr>
+            <w:r>
+              <w:rPr>
+                <w:sz w:val="18"/>
+                <w:szCs w:val="18"/>
+              </w:rPr>
+              <w:t>PLANNED</w:t>
             </w:r>
           </w:p>
         </w:tc>
@@ -15048,7 +15103,8 @@
         <w:tc>
           <w:tcPr>
             <w:tcW w:w="900" w:type="dxa"/>
-            <w:shd w:val="clear" w:color="auto" w:fill="FFFFFF"/>
+            <w:shd w:val="clear" w:color="auto" w:fill="FFFFFF" w:themeFill="background1"/>
+            <w:tcMar/>
           </w:tcPr>
           <w:p>
             <w:pPr>
@@ -15066,7 +15122,8 @@
         <w:tc>
           <w:tcPr>
             <w:tcW w:w="2000" w:type="dxa"/>
-            <w:shd w:val="clear" w:color="auto" w:fill="FFFFFF"/>
+            <w:shd w:val="clear" w:color="auto" w:fill="FFFFFF" w:themeFill="background1"/>
+            <w:tcMar/>
           </w:tcPr>
           <w:p>
             <w:pPr>
@@ -15084,7 +15141,8 @@
         <w:tc>
           <w:tcPr>
             <w:tcW w:w="1800" w:type="dxa"/>
-            <w:shd w:val="clear" w:color="auto" w:fill="FFFFFF"/>
+            <w:shd w:val="clear" w:color="auto" w:fill="FFFFFF" w:themeFill="background1"/>
+            <w:tcMar/>
           </w:tcPr>
           <w:p>
             <w:pPr>
@@ -15102,7 +15160,8 @@
         <w:tc>
           <w:tcPr>
             <w:tcW w:w="1400" w:type="dxa"/>
-            <w:shd w:val="clear" w:color="auto" w:fill="FFFFFF"/>
+            <w:shd w:val="clear" w:color="auto" w:fill="FFFFFF" w:themeFill="background1"/>
+            <w:tcMar/>
           </w:tcPr>
           <w:p>
             <w:pPr>
@@ -15120,18 +15179,19 @@
         <w:tc>
           <w:tcPr>
             <w:tcW w:w="1700" w:type="dxa"/>
-            <w:shd w:val="clear" w:color="auto" w:fill="FFFFFF"/>
-          </w:tcPr>
-          <w:p>
-            <w:pPr>
-              <w:spacing w:before="50" w:after="50"/>
-            </w:pPr>
-            <w:r>
-              <w:rPr>
-                <w:sz w:val="18"/>
-                <w:szCs w:val="18"/>
-              </w:rPr>
-              <w:t>⏳</w:t>
+            <w:shd w:val="clear" w:color="auto" w:fill="FFFFFF" w:themeFill="background1"/>
+            <w:tcMar/>
+          </w:tcPr>
+          <w:p>
+            <w:pPr>
+              <w:spacing w:before="50" w:after="50"/>
+            </w:pPr>
+            <w:r>
+              <w:rPr>
+                <w:sz w:val="18"/>
+                <w:szCs w:val="18"/>
+              </w:rPr>
+              <w:t>PLANNED</w:t>
             </w:r>
           </w:p>
         </w:tc>
@@ -15146,7 +15206,8 @@
         <w:tc>
           <w:tcPr>
             <w:tcW w:w="900" w:type="dxa"/>
-            <w:shd w:val="clear" w:color="auto" w:fill="F2F2F2"/>
+            <w:shd w:val="clear" w:color="auto" w:fill="F2F2F2" w:themeFill="background1" w:themeFillShade="F2"/>
+            <w:tcMar/>
           </w:tcPr>
           <w:p>
             <w:pPr>
@@ -15164,7 +15225,8 @@
         <w:tc>
           <w:tcPr>
             <w:tcW w:w="2000" w:type="dxa"/>
-            <w:shd w:val="clear" w:color="auto" w:fill="F2F2F2"/>
+            <w:shd w:val="clear" w:color="auto" w:fill="F2F2F2" w:themeFill="background1" w:themeFillShade="F2"/>
+            <w:tcMar/>
           </w:tcPr>
           <w:p>
             <w:pPr>
@@ -15182,7 +15244,8 @@
         <w:tc>
           <w:tcPr>
             <w:tcW w:w="1800" w:type="dxa"/>
-            <w:shd w:val="clear" w:color="auto" w:fill="F2F2F2"/>
+            <w:shd w:val="clear" w:color="auto" w:fill="F2F2F2" w:themeFill="background1" w:themeFillShade="F2"/>
+            <w:tcMar/>
           </w:tcPr>
           <w:p>
             <w:pPr>
@@ -15200,7 +15263,8 @@
         <w:tc>
           <w:tcPr>
             <w:tcW w:w="1400" w:type="dxa"/>
-            <w:shd w:val="clear" w:color="auto" w:fill="F2F2F2"/>
+            <w:shd w:val="clear" w:color="auto" w:fill="F2F2F2" w:themeFill="background1" w:themeFillShade="F2"/>
+            <w:tcMar/>
           </w:tcPr>
           <w:p>
             <w:pPr>
@@ -15220,18 +15284,19 @@
         <w:tc>
           <w:tcPr>
             <w:tcW w:w="1700" w:type="dxa"/>
-            <w:shd w:val="clear" w:color="auto" w:fill="F2F2F2"/>
-          </w:tcPr>
-          <w:p>
-            <w:pPr>
-              <w:spacing w:before="50" w:after="50"/>
-            </w:pPr>
-            <w:r>
-              <w:rPr>
-                <w:sz w:val="18"/>
-                <w:szCs w:val="18"/>
-              </w:rPr>
-              <w:t>⏳</w:t>
+            <w:shd w:val="clear" w:color="auto" w:fill="F2F2F2" w:themeFill="background1" w:themeFillShade="F2"/>
+            <w:tcMar/>
+          </w:tcPr>
+          <w:p>
+            <w:pPr>
+              <w:spacing w:before="50" w:after="50"/>
+            </w:pPr>
+            <w:r>
+              <w:rPr>
+                <w:sz w:val="18"/>
+                <w:szCs w:val="18"/>
+              </w:rPr>
+              <w:t>PLANNED</w:t>
             </w:r>
           </w:p>
         </w:tc>
@@ -15246,7 +15311,8 @@
         <w:tc>
           <w:tcPr>
             <w:tcW w:w="900" w:type="dxa"/>
-            <w:shd w:val="clear" w:color="auto" w:fill="FFFFFF"/>
+            <w:shd w:val="clear" w:color="auto" w:fill="FFFFFF" w:themeFill="background1"/>
+            <w:tcMar/>
           </w:tcPr>
           <w:p>
             <w:pPr>
@@ -15264,7 +15330,8 @@
         <w:tc>
           <w:tcPr>
             <w:tcW w:w="2000" w:type="dxa"/>
-            <w:shd w:val="clear" w:color="auto" w:fill="FFFFFF"/>
+            <w:shd w:val="clear" w:color="auto" w:fill="FFFFFF" w:themeFill="background1"/>
+            <w:tcMar/>
           </w:tcPr>
           <w:p>
             <w:pPr>
@@ -15282,7 +15349,8 @@
         <w:tc>
           <w:tcPr>
             <w:tcW w:w="1800" w:type="dxa"/>
-            <w:shd w:val="clear" w:color="auto" w:fill="FFFFFF"/>
+            <w:shd w:val="clear" w:color="auto" w:fill="FFFFFF" w:themeFill="background1"/>
+            <w:tcMar/>
           </w:tcPr>
           <w:p>
             <w:pPr>
@@ -15300,7 +15368,8 @@
         <w:tc>
           <w:tcPr>
             <w:tcW w:w="1400" w:type="dxa"/>
-            <w:shd w:val="clear" w:color="auto" w:fill="FFFFFF"/>
+            <w:shd w:val="clear" w:color="auto" w:fill="FFFFFF" w:themeFill="background1"/>
+            <w:tcMar/>
           </w:tcPr>
           <w:p>
             <w:pPr>
@@ -15318,18 +15387,19 @@
         <w:tc>
           <w:tcPr>
             <w:tcW w:w="1700" w:type="dxa"/>
-            <w:shd w:val="clear" w:color="auto" w:fill="FFFFFF"/>
-          </w:tcPr>
-          <w:p>
-            <w:pPr>
-              <w:spacing w:before="50" w:after="50"/>
-            </w:pPr>
-            <w:r>
-              <w:rPr>
-                <w:sz w:val="18"/>
-                <w:szCs w:val="18"/>
-              </w:rPr>
-              <w:t>⏳</w:t>
+            <w:shd w:val="clear" w:color="auto" w:fill="FFFFFF" w:themeFill="background1"/>
+            <w:tcMar/>
+          </w:tcPr>
+          <w:p>
+            <w:pPr>
+              <w:spacing w:before="50" w:after="50"/>
+            </w:pPr>
+            <w:r>
+              <w:rPr>
+                <w:sz w:val="18"/>
+                <w:szCs w:val="18"/>
+              </w:rPr>
+              <w:t>PLANNED</w:t>
             </w:r>
           </w:p>
         </w:tc>
@@ -15344,7 +15414,8 @@
         <w:tc>
           <w:tcPr>
             <w:tcW w:w="900" w:type="dxa"/>
-            <w:shd w:val="clear" w:color="auto" w:fill="F2F2F2"/>
+            <w:shd w:val="clear" w:color="auto" w:fill="F2F2F2" w:themeFill="background1" w:themeFillShade="F2"/>
+            <w:tcMar/>
           </w:tcPr>
           <w:p>
             <w:pPr>
@@ -15362,7 +15433,8 @@
         <w:tc>
           <w:tcPr>
             <w:tcW w:w="2000" w:type="dxa"/>
-            <w:shd w:val="clear" w:color="auto" w:fill="F2F2F2"/>
+            <w:shd w:val="clear" w:color="auto" w:fill="F2F2F2" w:themeFill="background1" w:themeFillShade="F2"/>
+            <w:tcMar/>
           </w:tcPr>
           <w:p>
             <w:pPr>
@@ -15380,7 +15452,8 @@
         <w:tc>
           <w:tcPr>
             <w:tcW w:w="1800" w:type="dxa"/>
-            <w:shd w:val="clear" w:color="auto" w:fill="F2F2F2"/>
+            <w:shd w:val="clear" w:color="auto" w:fill="F2F2F2" w:themeFill="background1" w:themeFillShade="F2"/>
+            <w:tcMar/>
           </w:tcPr>
           <w:p>
             <w:pPr>
@@ -15398,7 +15471,8 @@
         <w:tc>
           <w:tcPr>
             <w:tcW w:w="1400" w:type="dxa"/>
-            <w:shd w:val="clear" w:color="auto" w:fill="F2F2F2"/>
+            <w:shd w:val="clear" w:color="auto" w:fill="F2F2F2" w:themeFill="background1" w:themeFillShade="F2"/>
+            <w:tcMar/>
           </w:tcPr>
           <w:p>
             <w:pPr>
@@ -15416,18 +15490,19 @@
         <w:tc>
           <w:tcPr>
             <w:tcW w:w="1700" w:type="dxa"/>
-            <w:shd w:val="clear" w:color="auto" w:fill="F2F2F2"/>
-          </w:tcPr>
-          <w:p>
-            <w:pPr>
-              <w:spacing w:before="50" w:after="50"/>
-            </w:pPr>
-            <w:r>
-              <w:rPr>
-                <w:sz w:val="18"/>
-                <w:szCs w:val="18"/>
-              </w:rPr>
-              <w:t>⏳</w:t>
+            <w:shd w:val="clear" w:color="auto" w:fill="F2F2F2" w:themeFill="background1" w:themeFillShade="F2"/>
+            <w:tcMar/>
+          </w:tcPr>
+          <w:p>
+            <w:pPr>
+              <w:spacing w:before="50" w:after="50"/>
+            </w:pPr>
+            <w:r>
+              <w:rPr>
+                <w:sz w:val="18"/>
+                <w:szCs w:val="18"/>
+              </w:rPr>
+              <w:t>PLANNED</w:t>
             </w:r>
           </w:p>
         </w:tc>
@@ -15442,7 +15517,8 @@
         <w:tc>
           <w:tcPr>
             <w:tcW w:w="900" w:type="dxa"/>
-            <w:shd w:val="clear" w:color="auto" w:fill="FFFFFF"/>
+            <w:shd w:val="clear" w:color="auto" w:fill="FFFFFF" w:themeFill="background1"/>
+            <w:tcMar/>
           </w:tcPr>
           <w:p>
             <w:pPr>
@@ -15460,7 +15536,8 @@
         <w:tc>
           <w:tcPr>
             <w:tcW w:w="2000" w:type="dxa"/>
-            <w:shd w:val="clear" w:color="auto" w:fill="FFFFFF"/>
+            <w:shd w:val="clear" w:color="auto" w:fill="FFFFFF" w:themeFill="background1"/>
+            <w:tcMar/>
           </w:tcPr>
           <w:p>
             <w:pPr>
@@ -15478,7 +15555,8 @@
         <w:tc>
           <w:tcPr>
             <w:tcW w:w="1800" w:type="dxa"/>
-            <w:shd w:val="clear" w:color="auto" w:fill="FFFFFF"/>
+            <w:shd w:val="clear" w:color="auto" w:fill="FFFFFF" w:themeFill="background1"/>
+            <w:tcMar/>
           </w:tcPr>
           <w:p>
             <w:pPr>
@@ -15496,7 +15574,8 @@
         <w:tc>
           <w:tcPr>
             <w:tcW w:w="1400" w:type="dxa"/>
-            <w:shd w:val="clear" w:color="auto" w:fill="FFFFFF"/>
+            <w:shd w:val="clear" w:color="auto" w:fill="FFFFFF" w:themeFill="background1"/>
+            <w:tcMar/>
           </w:tcPr>
           <w:p>
             <w:pPr>
@@ -15514,18 +15593,19 @@
         <w:tc>
           <w:tcPr>
             <w:tcW w:w="1700" w:type="dxa"/>
-            <w:shd w:val="clear" w:color="auto" w:fill="FFFFFF"/>
-          </w:tcPr>
-          <w:p>
-            <w:pPr>
-              <w:spacing w:before="50" w:after="50"/>
-            </w:pPr>
-            <w:r>
-              <w:rPr>
-                <w:sz w:val="18"/>
-                <w:szCs w:val="18"/>
-              </w:rPr>
-              <w:t>⏳</w:t>
+            <w:shd w:val="clear" w:color="auto" w:fill="FFFFFF" w:themeFill="background1"/>
+            <w:tcMar/>
+          </w:tcPr>
+          <w:p>
+            <w:pPr>
+              <w:spacing w:before="50" w:after="50"/>
+            </w:pPr>
+            <w:r>
+              <w:rPr>
+                <w:sz w:val="18"/>
+                <w:szCs w:val="18"/>
+              </w:rPr>
+              <w:t>PLANNED</w:t>
             </w:r>
           </w:p>
         </w:tc>
@@ -15540,7 +15620,8 @@
         <w:tc>
           <w:tcPr>
             <w:tcW w:w="900" w:type="dxa"/>
-            <w:shd w:val="clear" w:color="auto" w:fill="F2F2F2"/>
+            <w:shd w:val="clear" w:color="auto" w:fill="F2F2F2" w:themeFill="background1" w:themeFillShade="F2"/>
+            <w:tcMar/>
           </w:tcPr>
           <w:p>
             <w:pPr>
@@ -15558,7 +15639,8 @@
         <w:tc>
           <w:tcPr>
             <w:tcW w:w="2000" w:type="dxa"/>
-            <w:shd w:val="clear" w:color="auto" w:fill="F2F2F2"/>
+            <w:shd w:val="clear" w:color="auto" w:fill="F2F2F2" w:themeFill="background1" w:themeFillShade="F2"/>
+            <w:tcMar/>
           </w:tcPr>
           <w:p>
             <w:pPr>
@@ -15576,7 +15658,8 @@
         <w:tc>
           <w:tcPr>
             <w:tcW w:w="1800" w:type="dxa"/>
-            <w:shd w:val="clear" w:color="auto" w:fill="F2F2F2"/>
+            <w:shd w:val="clear" w:color="auto" w:fill="F2F2F2" w:themeFill="background1" w:themeFillShade="F2"/>
+            <w:tcMar/>
           </w:tcPr>
           <w:p>
             <w:pPr>
@@ -15594,7 +15677,8 @@
         <w:tc>
           <w:tcPr>
             <w:tcW w:w="1400" w:type="dxa"/>
-            <w:shd w:val="clear" w:color="auto" w:fill="F2F2F2"/>
+            <w:shd w:val="clear" w:color="auto" w:fill="F2F2F2" w:themeFill="background1" w:themeFillShade="F2"/>
+            <w:tcMar/>
           </w:tcPr>
           <w:p>
             <w:pPr>
@@ -15612,18 +15696,19 @@
         <w:tc>
           <w:tcPr>
             <w:tcW w:w="1700" w:type="dxa"/>
-            <w:shd w:val="clear" w:color="auto" w:fill="F2F2F2"/>
-          </w:tcPr>
-          <w:p>
-            <w:pPr>
-              <w:spacing w:before="50" w:after="50"/>
-            </w:pPr>
-            <w:r>
-              <w:rPr>
-                <w:sz w:val="18"/>
-                <w:szCs w:val="18"/>
-              </w:rPr>
-              <w:t>⏳</w:t>
+            <w:shd w:val="clear" w:color="auto" w:fill="F2F2F2" w:themeFill="background1" w:themeFillShade="F2"/>
+            <w:tcMar/>
+          </w:tcPr>
+          <w:p>
+            <w:pPr>
+              <w:spacing w:before="50" w:after="50"/>
+            </w:pPr>
+            <w:r>
+              <w:rPr>
+                <w:sz w:val="18"/>
+                <w:szCs w:val="18"/>
+              </w:rPr>
+              <w:t>PLANNED</w:t>
             </w:r>
           </w:p>
         </w:tc>
@@ -15638,11 +15723,12 @@
         <w:tc>
           <w:tcPr>
             <w:tcW w:w="900" w:type="dxa"/>
-            <w:shd w:val="clear" w:color="auto" w:fill="FFFFFF"/>
-          </w:tcPr>
-          <w:p>
-            <w:pPr>
-              <w:spacing w:before="50" w:after="50"/>
+            <w:shd w:val="clear" w:color="auto" w:fill="FFFFFF" w:themeFill="background1"/>
+            <w:tcMar/>
+          </w:tcPr>
+          <w:p>
+            <w:pPr>
+              <w:pStyle w:val="Normal"/>
             </w:pPr>
             <w:r>
               <w:rPr>
@@ -15656,7 +15742,8 @@
         <w:tc>
           <w:tcPr>
             <w:tcW w:w="2000" w:type="dxa"/>
-            <w:shd w:val="clear" w:color="auto" w:fill="FFFFFF"/>
+            <w:shd w:val="clear" w:color="auto" w:fill="FFFFFF" w:themeFill="background1"/>
+            <w:tcMar/>
           </w:tcPr>
           <w:p>
             <w:pPr>
@@ -15683,7 +15770,8 @@
         <w:tc>
           <w:tcPr>
             <w:tcW w:w="1800" w:type="dxa"/>
-            <w:shd w:val="clear" w:color="auto" w:fill="FFFFFF"/>
+            <w:shd w:val="clear" w:color="auto" w:fill="FFFFFF" w:themeFill="background1"/>
+            <w:tcMar/>
           </w:tcPr>
           <w:p>
             <w:pPr>
@@ -15701,7 +15789,8 @@
         <w:tc>
           <w:tcPr>
             <w:tcW w:w="1400" w:type="dxa"/>
-            <w:shd w:val="clear" w:color="auto" w:fill="FFFFFF"/>
+            <w:shd w:val="clear" w:color="auto" w:fill="FFFFFF" w:themeFill="background1"/>
+            <w:tcMar/>
           </w:tcPr>
           <w:p>
             <w:pPr>
@@ -15719,18 +15808,19 @@
         <w:tc>
           <w:tcPr>
             <w:tcW w:w="1700" w:type="dxa"/>
-            <w:shd w:val="clear" w:color="auto" w:fill="FFFFFF"/>
-          </w:tcPr>
-          <w:p>
-            <w:pPr>
-              <w:spacing w:before="50" w:after="50"/>
-            </w:pPr>
-            <w:r>
-              <w:rPr>
-                <w:sz w:val="18"/>
-                <w:szCs w:val="18"/>
-              </w:rPr>
-              <w:t>⏳</w:t>
+            <w:shd w:val="clear" w:color="auto" w:fill="FFFFFF" w:themeFill="background1"/>
+            <w:tcMar/>
+          </w:tcPr>
+          <w:p>
+            <w:pPr>
+              <w:spacing w:before="50" w:after="50"/>
+            </w:pPr>
+            <w:r>
+              <w:rPr>
+                <w:sz w:val="18"/>
+                <w:szCs w:val="18"/>
+              </w:rPr>
+              <w:t>PLANNED</w:t>
             </w:r>
           </w:p>
         </w:tc>
@@ -15745,7 +15835,8 @@
         <w:tc>
           <w:tcPr>
             <w:tcW w:w="900" w:type="dxa"/>
-            <w:shd w:val="clear" w:color="auto" w:fill="F2F2F2"/>
+            <w:shd w:val="clear" w:color="auto" w:fill="F2F2F2" w:themeFill="background1" w:themeFillShade="F2"/>
+            <w:tcMar/>
           </w:tcPr>
           <w:p>
             <w:pPr>
@@ -15763,7 +15854,8 @@
         <w:tc>
           <w:tcPr>
             <w:tcW w:w="2000" w:type="dxa"/>
-            <w:shd w:val="clear" w:color="auto" w:fill="F2F2F2"/>
+            <w:shd w:val="clear" w:color="auto" w:fill="F2F2F2" w:themeFill="background1" w:themeFillShade="F2"/>
+            <w:tcMar/>
           </w:tcPr>
           <w:p>
             <w:pPr>
@@ -15781,7 +15873,8 @@
         <w:tc>
           <w:tcPr>
             <w:tcW w:w="1800" w:type="dxa"/>
-            <w:shd w:val="clear" w:color="auto" w:fill="F2F2F2"/>
+            <w:shd w:val="clear" w:color="auto" w:fill="F2F2F2" w:themeFill="background1" w:themeFillShade="F2"/>
+            <w:tcMar/>
           </w:tcPr>
           <w:p>
             <w:pPr>
@@ -15799,7 +15892,8 @@
         <w:tc>
           <w:tcPr>
             <w:tcW w:w="1400" w:type="dxa"/>
-            <w:shd w:val="clear" w:color="auto" w:fill="F2F2F2"/>
+            <w:shd w:val="clear" w:color="auto" w:fill="F2F2F2" w:themeFill="background1" w:themeFillShade="F2"/>
+            <w:tcMar/>
           </w:tcPr>
           <w:p>
             <w:pPr>
@@ -15817,18 +15911,19 @@
         <w:tc>
           <w:tcPr>
             <w:tcW w:w="1700" w:type="dxa"/>
-            <w:shd w:val="clear" w:color="auto" w:fill="F2F2F2"/>
-          </w:tcPr>
-          <w:p>
-            <w:pPr>
-              <w:spacing w:before="50" w:after="50"/>
-            </w:pPr>
-            <w:r>
-              <w:rPr>
-                <w:sz w:val="18"/>
-                <w:szCs w:val="18"/>
-              </w:rPr>
-              <w:t>⏳</w:t>
+            <w:shd w:val="clear" w:color="auto" w:fill="F2F2F2" w:themeFill="background1" w:themeFillShade="F2"/>
+            <w:tcMar/>
+          </w:tcPr>
+          <w:p>
+            <w:pPr>
+              <w:spacing w:before="50" w:after="50"/>
+            </w:pPr>
+            <w:r>
+              <w:rPr>
+                <w:sz w:val="18"/>
+                <w:szCs w:val="18"/>
+              </w:rPr>
+              <w:t>PLANNED</w:t>
             </w:r>
           </w:p>
         </w:tc>
@@ -15843,7 +15938,8 @@
         <w:tc>
           <w:tcPr>
             <w:tcW w:w="900" w:type="dxa"/>
-            <w:shd w:val="clear" w:color="auto" w:fill="FFFFFF"/>
+            <w:shd w:val="clear" w:color="auto" w:fill="FFFFFF" w:themeFill="background1"/>
+            <w:tcMar/>
           </w:tcPr>
           <w:p>
             <w:pPr>
@@ -15861,7 +15957,8 @@
         <w:tc>
           <w:tcPr>
             <w:tcW w:w="2000" w:type="dxa"/>
-            <w:shd w:val="clear" w:color="auto" w:fill="FFFFFF"/>
+            <w:shd w:val="clear" w:color="auto" w:fill="FFFFFF" w:themeFill="background1"/>
+            <w:tcMar/>
           </w:tcPr>
           <w:p>
             <w:pPr>
@@ -15879,7 +15976,8 @@
         <w:tc>
           <w:tcPr>
             <w:tcW w:w="1800" w:type="dxa"/>
-            <w:shd w:val="clear" w:color="auto" w:fill="FFFFFF"/>
+            <w:shd w:val="clear" w:color="auto" w:fill="FFFFFF" w:themeFill="background1"/>
+            <w:tcMar/>
           </w:tcPr>
           <w:p>
             <w:pPr>
@@ -15897,7 +15995,8 @@
         <w:tc>
           <w:tcPr>
             <w:tcW w:w="1400" w:type="dxa"/>
-            <w:shd w:val="clear" w:color="auto" w:fill="FFFFFF"/>
+            <w:shd w:val="clear" w:color="auto" w:fill="FFFFFF" w:themeFill="background1"/>
+            <w:tcMar/>
           </w:tcPr>
           <w:p>
             <w:pPr>
@@ -15915,18 +16014,19 @@
         <w:tc>
           <w:tcPr>
             <w:tcW w:w="1700" w:type="dxa"/>
-            <w:shd w:val="clear" w:color="auto" w:fill="FFFFFF"/>
-          </w:tcPr>
-          <w:p>
-            <w:pPr>
-              <w:spacing w:before="50" w:after="50"/>
-            </w:pPr>
-            <w:r>
-              <w:rPr>
-                <w:sz w:val="18"/>
-                <w:szCs w:val="18"/>
-              </w:rPr>
-              <w:t>⏳</w:t>
+            <w:shd w:val="clear" w:color="auto" w:fill="FFFFFF" w:themeFill="background1"/>
+            <w:tcMar/>
+          </w:tcPr>
+          <w:p>
+            <w:pPr>
+              <w:spacing w:before="50" w:after="50"/>
+            </w:pPr>
+            <w:r>
+              <w:rPr>
+                <w:sz w:val="18"/>
+                <w:szCs w:val="18"/>
+              </w:rPr>
+              <w:t>PLANNED</w:t>
             </w:r>
           </w:p>
         </w:tc>
@@ -15941,7 +16041,8 @@
         <w:tc>
           <w:tcPr>
             <w:tcW w:w="900" w:type="dxa"/>
-            <w:shd w:val="clear" w:color="auto" w:fill="F2F2F2"/>
+            <w:shd w:val="clear" w:color="auto" w:fill="F2F2F2" w:themeFill="background1" w:themeFillShade="F2"/>
+            <w:tcMar/>
           </w:tcPr>
           <w:p>
             <w:pPr>
@@ -15959,7 +16060,8 @@
         <w:tc>
           <w:tcPr>
             <w:tcW w:w="2000" w:type="dxa"/>
-            <w:shd w:val="clear" w:color="auto" w:fill="F2F2F2"/>
+            <w:shd w:val="clear" w:color="auto" w:fill="F2F2F2" w:themeFill="background1" w:themeFillShade="F2"/>
+            <w:tcMar/>
           </w:tcPr>
           <w:p>
             <w:pPr>
@@ -15977,7 +16079,8 @@
         <w:tc>
           <w:tcPr>
             <w:tcW w:w="1800" w:type="dxa"/>
-            <w:shd w:val="clear" w:color="auto" w:fill="F2F2F2"/>
+            <w:shd w:val="clear" w:color="auto" w:fill="F2F2F2" w:themeFill="background1" w:themeFillShade="F2"/>
+            <w:tcMar/>
           </w:tcPr>
           <w:p>
             <w:pPr>
@@ -15995,7 +16098,8 @@
         <w:tc>
           <w:tcPr>
             <w:tcW w:w="1400" w:type="dxa"/>
-            <w:shd w:val="clear" w:color="auto" w:fill="F2F2F2"/>
+            <w:shd w:val="clear" w:color="auto" w:fill="F2F2F2" w:themeFill="background1" w:themeFillShade="F2"/>
+            <w:tcMar/>
           </w:tcPr>
           <w:p>
             <w:pPr>
@@ -16014,20 +16118,20 @@
         <w:tc>
           <w:tcPr>
             <w:tcW w:w="1700" w:type="dxa"/>
-            <w:shd w:val="clear" w:color="auto" w:fill="F2F2F2"/>
-          </w:tcPr>
-          <w:p>
-            <w:pPr>
-              <w:spacing w:before="50" w:after="50"/>
-            </w:pPr>
-            <w:r>
-              <w:rPr>
-                <w:sz w:val="18"/>
-                <w:szCs w:val="18"/>
-              </w:rPr>
-              <w:t>⏳</w:t>
-            </w:r>
-            <w:proofErr w:type="spellEnd"/>
+            <w:shd w:val="clear" w:color="auto" w:fill="F2F2F2" w:themeFill="background1" w:themeFillShade="F2"/>
+            <w:tcMar/>
+          </w:tcPr>
+          <w:p>
+            <w:pPr>
+              <w:spacing w:before="50" w:after="50"/>
+            </w:pPr>
+            <w:r>
+              <w:rPr>
+                <w:sz w:val="18"/>
+                <w:szCs w:val="18"/>
+              </w:rPr>
+              <w:t>PLANNED</w:t>
+            </w:r>
           </w:p>
         </w:tc>
       </w:tr>
@@ -16041,7 +16145,8 @@
         <w:tc>
           <w:tcPr>
             <w:tcW w:w="900" w:type="dxa"/>
-            <w:shd w:val="clear" w:color="auto" w:fill="FFFFFF"/>
+            <w:shd w:val="clear" w:color="auto" w:fill="FFFFFF" w:themeFill="background1"/>
+            <w:tcMar/>
           </w:tcPr>
           <w:p>
             <w:pPr>
@@ -16059,7 +16164,8 @@
         <w:tc>
           <w:tcPr>
             <w:tcW w:w="2000" w:type="dxa"/>
-            <w:shd w:val="clear" w:color="auto" w:fill="FFFFFF"/>
+            <w:shd w:val="clear" w:color="auto" w:fill="FFFFFF" w:themeFill="background1"/>
+            <w:tcMar/>
           </w:tcPr>
           <w:p>
             <w:pPr>
@@ -16077,7 +16183,8 @@
         <w:tc>
           <w:tcPr>
             <w:tcW w:w="1800" w:type="dxa"/>
-            <w:shd w:val="clear" w:color="auto" w:fill="FFFFFF"/>
+            <w:shd w:val="clear" w:color="auto" w:fill="FFFFFF" w:themeFill="background1"/>
+            <w:tcMar/>
           </w:tcPr>
           <w:p>
             <w:pPr>
@@ -16095,7 +16202,8 @@
         <w:tc>
           <w:tcPr>
             <w:tcW w:w="1400" w:type="dxa"/>
-            <w:shd w:val="clear" w:color="auto" w:fill="FFFFFF"/>
+            <w:shd w:val="clear" w:color="auto" w:fill="FFFFFF" w:themeFill="background1"/>
+            <w:tcMar/>
           </w:tcPr>
           <w:p>
             <w:pPr>
@@ -16113,18 +16221,19 @@
         <w:tc>
           <w:tcPr>
             <w:tcW w:w="1700" w:type="dxa"/>
-            <w:shd w:val="clear" w:color="auto" w:fill="FFFFFF"/>
-          </w:tcPr>
-          <w:p>
-            <w:pPr>
-              <w:spacing w:before="50" w:after="50"/>
-            </w:pPr>
-            <w:r>
-              <w:rPr>
-                <w:sz w:val="18"/>
-                <w:szCs w:val="18"/>
-              </w:rPr>
-              <w:t>⏳</w:t>
+            <w:shd w:val="clear" w:color="auto" w:fill="FFFFFF" w:themeFill="background1"/>
+            <w:tcMar/>
+          </w:tcPr>
+          <w:p>
+            <w:pPr>
+              <w:spacing w:before="50" w:after="50"/>
+            </w:pPr>
+            <w:r>
+              <w:rPr>
+                <w:sz w:val="18"/>
+                <w:szCs w:val="18"/>
+              </w:rPr>
+              <w:t>PLANNED</w:t>
             </w:r>
           </w:p>
         </w:tc>
@@ -16139,7 +16248,8 @@
         <w:tc>
           <w:tcPr>
             <w:tcW w:w="900" w:type="dxa"/>
-            <w:shd w:val="clear" w:color="auto" w:fill="F2F2F2"/>
+            <w:shd w:val="clear" w:color="auto" w:fill="F2F2F2" w:themeFill="background1" w:themeFillShade="F2"/>
+            <w:tcMar/>
           </w:tcPr>
           <w:p>
             <w:pPr>
@@ -16157,7 +16267,8 @@
         <w:tc>
           <w:tcPr>
             <w:tcW w:w="2000" w:type="dxa"/>
-            <w:shd w:val="clear" w:color="auto" w:fill="F2F2F2"/>
+            <w:shd w:val="clear" w:color="auto" w:fill="F2F2F2" w:themeFill="background1" w:themeFillShade="F2"/>
+            <w:tcMar/>
           </w:tcPr>
           <w:p>
             <w:pPr>
@@ -16175,7 +16286,8 @@
         <w:tc>
           <w:tcPr>
             <w:tcW w:w="1800" w:type="dxa"/>
-            <w:shd w:val="clear" w:color="auto" w:fill="F2F2F2"/>
+            <w:shd w:val="clear" w:color="auto" w:fill="F2F2F2" w:themeFill="background1" w:themeFillShade="F2"/>
+            <w:tcMar/>
           </w:tcPr>
           <w:p>
             <w:pPr>
@@ -16193,7 +16305,8 @@
         <w:tc>
           <w:tcPr>
             <w:tcW w:w="1400" w:type="dxa"/>
-            <w:shd w:val="clear" w:color="auto" w:fill="F2F2F2"/>
+            <w:shd w:val="clear" w:color="auto" w:fill="F2F2F2" w:themeFill="background1" w:themeFillShade="F2"/>
+            <w:tcMar/>
           </w:tcPr>
           <w:p>
             <w:pPr>
@@ -16211,18 +16324,19 @@
         <w:tc>
           <w:tcPr>
             <w:tcW w:w="1700" w:type="dxa"/>
-            <w:shd w:val="clear" w:color="auto" w:fill="F2F2F2"/>
-          </w:tcPr>
-          <w:p>
-            <w:pPr>
-              <w:spacing w:before="50" w:after="50"/>
-            </w:pPr>
-            <w:r>
-              <w:rPr>
-                <w:sz w:val="18"/>
-                <w:szCs w:val="18"/>
-              </w:rPr>
-              <w:t>⏳</w:t>
+            <w:shd w:val="clear" w:color="auto" w:fill="F2F2F2" w:themeFill="background1" w:themeFillShade="F2"/>
+            <w:tcMar/>
+          </w:tcPr>
+          <w:p>
+            <w:pPr>
+              <w:spacing w:before="50" w:after="50"/>
+            </w:pPr>
+            <w:r>
+              <w:rPr>
+                <w:sz w:val="18"/>
+                <w:szCs w:val="18"/>
+              </w:rPr>
+              <w:t>PLANNED</w:t>
             </w:r>
           </w:p>
         </w:tc>
@@ -16237,7 +16351,8 @@
         <w:tc>
           <w:tcPr>
             <w:tcW w:w="900" w:type="dxa"/>
-            <w:shd w:val="clear" w:color="auto" w:fill="FFFFFF"/>
+            <w:shd w:val="clear" w:color="auto" w:fill="FFFFFF" w:themeFill="background1"/>
+            <w:tcMar/>
           </w:tcPr>
           <w:p>
             <w:pPr>
@@ -16255,7 +16370,8 @@
         <w:tc>
           <w:tcPr>
             <w:tcW w:w="2000" w:type="dxa"/>
-            <w:shd w:val="clear" w:color="auto" w:fill="FFFFFF"/>
+            <w:shd w:val="clear" w:color="auto" w:fill="FFFFFF" w:themeFill="background1"/>
+            <w:tcMar/>
           </w:tcPr>
           <w:p>
             <w:pPr>
@@ -16273,7 +16389,8 @@
         <w:tc>
           <w:tcPr>
             <w:tcW w:w="1800" w:type="dxa"/>
-            <w:shd w:val="clear" w:color="auto" w:fill="FFFFFF"/>
+            <w:shd w:val="clear" w:color="auto" w:fill="FFFFFF" w:themeFill="background1"/>
+            <w:tcMar/>
           </w:tcPr>
           <w:p>
             <w:pPr>
@@ -16291,7 +16408,8 @@
         <w:tc>
           <w:tcPr>
             <w:tcW w:w="1400" w:type="dxa"/>
-            <w:shd w:val="clear" w:color="auto" w:fill="FFFFFF"/>
+            <w:shd w:val="clear" w:color="auto" w:fill="FFFFFF" w:themeFill="background1"/>
+            <w:tcMar/>
           </w:tcPr>
           <w:p>
             <w:pPr>
@@ -16309,18 +16427,19 @@
         <w:tc>
           <w:tcPr>
             <w:tcW w:w="1700" w:type="dxa"/>
-            <w:shd w:val="clear" w:color="auto" w:fill="FFFFFF"/>
-          </w:tcPr>
-          <w:p>
-            <w:pPr>
-              <w:spacing w:before="50" w:after="50"/>
-            </w:pPr>
-            <w:r>
-              <w:rPr>
-                <w:sz w:val="18"/>
-                <w:szCs w:val="18"/>
-              </w:rPr>
-              <w:t>⏳</w:t>
+            <w:shd w:val="clear" w:color="auto" w:fill="FFFFFF" w:themeFill="background1"/>
+            <w:tcMar/>
+          </w:tcPr>
+          <w:p>
+            <w:pPr>
+              <w:spacing w:before="50" w:after="50"/>
+            </w:pPr>
+            <w:r>
+              <w:rPr>
+                <w:sz w:val="18"/>
+                <w:szCs w:val="18"/>
+              </w:rPr>
+              <w:t>PLANNED</w:t>
             </w:r>
           </w:p>
         </w:tc>
@@ -16335,7 +16454,8 @@
         <w:tc>
           <w:tcPr>
             <w:tcW w:w="900" w:type="dxa"/>
-            <w:shd w:val="clear" w:color="auto" w:fill="F2F2F2"/>
+            <w:shd w:val="clear" w:color="auto" w:fill="F2F2F2" w:themeFill="background1" w:themeFillShade="F2"/>
+            <w:tcMar/>
           </w:tcPr>
           <w:p>
             <w:pPr>
@@ -16353,7 +16473,8 @@
         <w:tc>
           <w:tcPr>
             <w:tcW w:w="2000" w:type="dxa"/>
-            <w:shd w:val="clear" w:color="auto" w:fill="F2F2F2"/>
+            <w:shd w:val="clear" w:color="auto" w:fill="F2F2F2" w:themeFill="background1" w:themeFillShade="F2"/>
+            <w:tcMar/>
           </w:tcPr>
           <w:p>
             <w:pPr>
@@ -16371,7 +16492,8 @@
         <w:tc>
           <w:tcPr>
             <w:tcW w:w="1800" w:type="dxa"/>
-            <w:shd w:val="clear" w:color="auto" w:fill="F2F2F2"/>
+            <w:shd w:val="clear" w:color="auto" w:fill="F2F2F2" w:themeFill="background1" w:themeFillShade="F2"/>
+            <w:tcMar/>
           </w:tcPr>
           <w:p>
             <w:pPr>
@@ -16389,7 +16511,8 @@
         <w:tc>
           <w:tcPr>
             <w:tcW w:w="1400" w:type="dxa"/>
-            <w:shd w:val="clear" w:color="auto" w:fill="F2F2F2"/>
+            <w:shd w:val="clear" w:color="auto" w:fill="F2F2F2" w:themeFill="background1" w:themeFillShade="F2"/>
+            <w:tcMar/>
           </w:tcPr>
           <w:p>
             <w:pPr>
@@ -16407,18 +16530,19 @@
         <w:tc>
           <w:tcPr>
             <w:tcW w:w="1700" w:type="dxa"/>
-            <w:shd w:val="clear" w:color="auto" w:fill="F2F2F2"/>
-          </w:tcPr>
-          <w:p>
-            <w:pPr>
-              <w:spacing w:before="50" w:after="50"/>
-            </w:pPr>
-            <w:r>
-              <w:rPr>
-                <w:sz w:val="18"/>
-                <w:szCs w:val="18"/>
-              </w:rPr>
-              <w:t>⏳</w:t>
+            <w:shd w:val="clear" w:color="auto" w:fill="F2F2F2" w:themeFill="background1" w:themeFillShade="F2"/>
+            <w:tcMar/>
+          </w:tcPr>
+          <w:p>
+            <w:pPr>
+              <w:spacing w:before="50" w:after="50"/>
+            </w:pPr>
+            <w:r>
+              <w:rPr>
+                <w:sz w:val="18"/>
+                <w:szCs w:val="18"/>
+              </w:rPr>
+              <w:t>PLANNED</w:t>
             </w:r>
           </w:p>
         </w:tc>
@@ -16433,7 +16557,8 @@
         <w:tc>
           <w:tcPr>
             <w:tcW w:w="900" w:type="dxa"/>
-            <w:shd w:val="clear" w:color="auto" w:fill="FFFFFF"/>
+            <w:shd w:val="clear" w:color="auto" w:fill="FFFFFF" w:themeFill="background1"/>
+            <w:tcMar/>
           </w:tcPr>
           <w:p>
             <w:pPr>
@@ -16451,7 +16576,8 @@
         <w:tc>
           <w:tcPr>
             <w:tcW w:w="2000" w:type="dxa"/>
-            <w:shd w:val="clear" w:color="auto" w:fill="FFFFFF"/>
+            <w:shd w:val="clear" w:color="auto" w:fill="FFFFFF" w:themeFill="background1"/>
+            <w:tcMar/>
           </w:tcPr>
           <w:p>
             <w:pPr>
@@ -16469,7 +16595,8 @@
         <w:tc>
           <w:tcPr>
             <w:tcW w:w="1800" w:type="dxa"/>
-            <w:shd w:val="clear" w:color="auto" w:fill="FFFFFF"/>
+            <w:shd w:val="clear" w:color="auto" w:fill="FFFFFF" w:themeFill="background1"/>
+            <w:tcMar/>
           </w:tcPr>
           <w:p>
             <w:pPr>
@@ -16487,7 +16614,8 @@
         <w:tc>
           <w:tcPr>
             <w:tcW w:w="1400" w:type="dxa"/>
-            <w:shd w:val="clear" w:color="auto" w:fill="FFFFFF"/>
+            <w:shd w:val="clear" w:color="auto" w:fill="FFFFFF" w:themeFill="background1"/>
+            <w:tcMar/>
           </w:tcPr>
           <w:p>
             <w:pPr>
@@ -16505,18 +16633,19 @@
         <w:tc>
           <w:tcPr>
             <w:tcW w:w="1700" w:type="dxa"/>
-            <w:shd w:val="clear" w:color="auto" w:fill="FFFFFF"/>
-          </w:tcPr>
-          <w:p>
-            <w:pPr>
-              <w:spacing w:before="50" w:after="50"/>
-            </w:pPr>
-            <w:r>
-              <w:rPr>
-                <w:sz w:val="18"/>
-                <w:szCs w:val="18"/>
-              </w:rPr>
-              <w:t>⏳</w:t>
+            <w:shd w:val="clear" w:color="auto" w:fill="FFFFFF" w:themeFill="background1"/>
+            <w:tcMar/>
+          </w:tcPr>
+          <w:p>
+            <w:pPr>
+              <w:spacing w:before="50" w:after="50"/>
+            </w:pPr>
+            <w:r>
+              <w:rPr>
+                <w:sz w:val="18"/>
+                <w:szCs w:val="18"/>
+              </w:rPr>
+              <w:t>PLANNED</w:t>
             </w:r>
           </w:p>
         </w:tc>
@@ -16531,7 +16660,8 @@
         <w:tc>
           <w:tcPr>
             <w:tcW w:w="900" w:type="dxa"/>
-            <w:shd w:val="clear" w:color="auto" w:fill="F2F2F2"/>
+            <w:shd w:val="clear" w:color="auto" w:fill="F2F2F2" w:themeFill="background1" w:themeFillShade="F2"/>
+            <w:tcMar/>
           </w:tcPr>
           <w:p>
             <w:pPr>
@@ -16549,7 +16679,8 @@
         <w:tc>
           <w:tcPr>
             <w:tcW w:w="2000" w:type="dxa"/>
-            <w:shd w:val="clear" w:color="auto" w:fill="F2F2F2"/>
+            <w:shd w:val="clear" w:color="auto" w:fill="F2F2F2" w:themeFill="background1" w:themeFillShade="F2"/>
+            <w:tcMar/>
           </w:tcPr>
           <w:p>
             <w:pPr>
@@ -16567,7 +16698,8 @@
         <w:tc>
           <w:tcPr>
             <w:tcW w:w="1800" w:type="dxa"/>
-            <w:shd w:val="clear" w:color="auto" w:fill="F2F2F2"/>
+            <w:shd w:val="clear" w:color="auto" w:fill="F2F2F2" w:themeFill="background1" w:themeFillShade="F2"/>
+            <w:tcMar/>
           </w:tcPr>
           <w:p>
             <w:pPr>
@@ -16585,7 +16717,8 @@
         <w:tc>
           <w:tcPr>
             <w:tcW w:w="1400" w:type="dxa"/>
-            <w:shd w:val="clear" w:color="auto" w:fill="F2F2F2"/>
+            <w:shd w:val="clear" w:color="auto" w:fill="F2F2F2" w:themeFill="background1" w:themeFillShade="F2"/>
+            <w:tcMar/>
           </w:tcPr>
           <w:p>
             <w:pPr>
@@ -16603,18 +16736,19 @@
         <w:tc>
           <w:tcPr>
             <w:tcW w:w="1700" w:type="dxa"/>
-            <w:shd w:val="clear" w:color="auto" w:fill="F2F2F2"/>
-          </w:tcPr>
-          <w:p>
-            <w:pPr>
-              <w:spacing w:before="50" w:after="50"/>
-            </w:pPr>
-            <w:r>
-              <w:rPr>
-                <w:sz w:val="18"/>
-                <w:szCs w:val="18"/>
-              </w:rPr>
-              <w:t>⏳</w:t>
+            <w:shd w:val="clear" w:color="auto" w:fill="F2F2F2" w:themeFill="background1" w:themeFillShade="F2"/>
+            <w:tcMar/>
+          </w:tcPr>
+          <w:p>
+            <w:pPr>
+              <w:spacing w:before="50" w:after="50"/>
+            </w:pPr>
+            <w:r>
+              <w:rPr>
+                <w:sz w:val="18"/>
+                <w:szCs w:val="18"/>
+              </w:rPr>
+              <w:t>PLANNED</w:t>
             </w:r>
           </w:p>
         </w:tc>
@@ -16630,7 +16764,52 @@
         <w:spacing w:before="60" w:after="60"/>
       </w:pPr>
       <w:r>
-        <w:t>Status legend: ⏳ Planned  🔄 In Progress  ✅ PASS  ⚠️ WARN  ❌ FAIL</w:t>
+        <w:rPr/>
+        <w:t xml:space="preserve">Status legend: </w:t>
+      </w:r>
+      <w:r>
+        <w:rPr/>
+        <w:t>PLANNED</w:t>
+      </w:r>
+      <w:r>
+        <w:rPr/>
+        <w:t>,</w:t>
+      </w:r>
+      <w:r>
+        <w:rPr/>
+        <w:t xml:space="preserve"> </w:t>
+      </w:r>
+      <w:r>
+        <w:rPr/>
+        <w:t>IN PROGRESS</w:t>
+      </w:r>
+      <w:r>
+        <w:rPr/>
+        <w:t>,</w:t>
+      </w:r>
+      <w:r>
+        <w:rPr/>
+        <w:t xml:space="preserve">  </w:t>
+      </w:r>
+      <w:r>
+        <w:rPr/>
+        <w:t>PASS,</w:t>
+      </w:r>
+      <w:r>
+        <w:rPr/>
+        <w:t xml:space="preserve">  </w:t>
+      </w:r>
+      <w:r>
+        <w:rPr/>
+        <w:t>WARN,</w:t>
+      </w:r>
+      <w:r>
+        <w:rPr/>
+        <w:t xml:space="preserve">  </w:t>
+      </w:r>
+      <w:r>
+        <w:rPr/>
+        <w:t>FAIL</w:t>
       </w:r>
     </w:p>
     <w:p>

</xml_diff>